<commit_message>
N.D. Fla. bankruptcy adversary complaint and motion brief: typst and docx on the shared cross-engine layout model, Times New Roman 14 pt on both (LR 5.1(C) via LBR 1001-1(C); the docx had named EB Garamond: DEF-FONT-002 and TNR-EMBEDDED failed), 32.2 pt double pitch as filed, 16.1 pt single lines; docx/make-reference.sh, render.sh and reference.docx give way to docx/reference.xml (base="xengine", {font}, pandoc-from markdown-fancy_lists+smart as render.sh read); the filters write every paragraph in exact typst pitches; headings centered and bold (the old typst show rules never matched); motion-brief footnotes 14 pt on the single pitch, both engines certify 135 words; a quotation mark before a letter read as opening, as typst reads it. docx XENG-001..003 pass, params.cross_engine: gate; typst 9 and docx 13 checks passed, 0 failed on both (fb-595.68.11)
</commit_message>
<xml_diff>
--- a/courts/eleventh-circuit/florida/federal/bankruptcy-northern-district/motion-brief/usage/OUTPUT-motion-brief.docx
+++ b/courts/eleventh-circuit/florida/federal/bankruptcy-northern-district/motion-brief/usage/OUTPUT-motion-brief.docx
@@ -4,7 +4,7 @@
   <w:body>
     <w:p>
       <w:pPr>
-        <w:spacing w:before="0" w:after="0" w:line="308" w:lineRule="exact"/>
+        <w:spacing w:before="0" w:after="0" w:line="322" w:lineRule="exact"/>
         <w:ind w:left="0" w:firstLine="0"/>
         <w:jc w:val="center"/>
       </w:pPr>
@@ -14,7 +14,7 @@
     </w:p>
     <w:p>
       <w:pPr>
-        <w:spacing w:before="0" w:after="0" w:line="308" w:lineRule="exact"/>
+        <w:spacing w:before="0" w:after="0" w:line="322" w:lineRule="exact"/>
         <w:ind w:left="0" w:firstLine="0"/>
         <w:jc w:val="center"/>
       </w:pPr>
@@ -24,91 +24,266 @@
     </w:p>
     <w:p>
       <w:pPr>
-        <w:spacing w:before="0" w:after="0" w:line="308" w:lineRule="exact"/>
+        <w:spacing w:before="0" w:after="644" w:line="322" w:lineRule="exact"/>
         <w:ind w:left="0" w:firstLine="0"/>
         <w:jc w:val="center"/>
       </w:pPr>
       <w:r>
         <w:t xml:space="preserve">TALLAHASSEE DIVISION</w:t>
       </w:r>
-    </w:p>
-    <w:p>
-      <w:pPr>
-        <w:spacing w:before="0" w:after="0" w:line="756" w:lineRule="exact"/>
-        <w:ind w:left="0" w:firstLine="0"/>
-      </w:pPr>
     </w:p>
     <w:tbl>
       <w:tblPr>
         <w:tblW w:w="9360" w:type="dxa"/>
-        <w:tblBorders>
-          <w:top w:val="nil"/>
-          <w:left w:val="nil"/>
-          <w:bottom w:val="nil"/>
-          <w:right w:val="nil"/>
-          <w:insideH w:val="nil"/>
-          <w:insideV w:val="nil"/>
-        </w:tblBorders>
         <w:tblLayout w:type="fixed"/>
         <w:tblCellMar>
+          <w:top w:w="0" w:type="dxa"/>
           <w:left w:w="0" w:type="dxa"/>
+          <w:bottom w:w="0" w:type="dxa"/>
           <w:right w:w="0" w:type="dxa"/>
         </w:tblCellMar>
-        <w:tblLook w:val="0000"/>
+        <w:tblLook w:val="0000" w:firstRow="0" w:lastRow="0" w:firstColumn="0" w:lastColumn="0" w:noHBand="0" w:noVBand="0"/>
       </w:tblPr>
       <w:tblGrid>
-        <w:gridCol w:w="5806"/>
-        <w:gridCol w:w="280"/>
-        <w:gridCol w:w="3274"/>
+        <w:gridCol w:w="5688"/>
+        <w:gridCol w:w="144"/>
+        <w:gridCol w:w="3528"/>
       </w:tblGrid>
       <w:tr>
-        <w:tc>
-          <w:tcPr>
-            <w:tcW w:w="5806" w:type="dxa"/>
-          </w:tcPr>
-          <w:p>
-            <w:pPr>
-              <w:spacing w:before="0" w:after="0" w:line="308" w:lineRule="exact"/>
-              <w:ind w:left="0" w:firstLine="0"/>
+        <w:trPr>
+          <w:cantSplit/>
+        </w:trPr>
+        <w:tc>
+          <w:tcPr>
+            <w:tcW w:w="5688" w:type="dxa"/>
+          </w:tcPr>
+          <w:p>
+            <w:pPr>
+              <w:spacing w:before="0" w:after="0" w:line="322" w:lineRule="exact"/>
+              <w:ind w:left="0" w:firstLine="0"/>
+              <w:jc w:val="left"/>
             </w:pPr>
             <w:r>
               <w:t xml:space="preserve">IN RE:</w:t>
             </w:r>
           </w:p>
-          <w:p>
-            <w:pPr>
-              <w:spacing w:before="0" w:after="0" w:line="308" w:lineRule="exact"/>
-              <w:ind w:left="0" w:firstLine="0"/>
-            </w:pPr>
-          </w:p>
-          <w:p>
-            <w:pPr>
-              <w:spacing w:before="0" w:after="0" w:line="308" w:lineRule="exact"/>
-              <w:ind w:left="0" w:firstLine="0"/>
+        </w:tc>
+        <w:tc>
+          <w:tcPr>
+            <w:tcW w:w="144" w:type="dxa"/>
+          </w:tcPr>
+          <w:p>
+            <w:pPr>
+              <w:spacing w:before="0" w:after="0" w:line="322" w:lineRule="exact"/>
+              <w:ind w:left="0" w:firstLine="0"/>
+              <w:jc w:val="left"/>
+            </w:pPr>
+          </w:p>
+        </w:tc>
+        <w:tc>
+          <w:tcPr>
+            <w:tcW w:w="3528" w:type="dxa"/>
+          </w:tcPr>
+          <w:p>
+            <w:pPr>
+              <w:spacing w:before="0" w:after="0" w:line="322" w:lineRule="exact"/>
+              <w:ind w:left="0" w:firstLine="0"/>
+              <w:jc w:val="left"/>
+            </w:pPr>
+          </w:p>
+        </w:tc>
+      </w:tr>
+      <w:tr>
+        <w:trPr>
+          <w:cantSplit/>
+        </w:trPr>
+        <w:tc>
+          <w:tcPr>
+            <w:tcW w:w="5688" w:type="dxa"/>
+          </w:tcPr>
+          <w:p>
+            <w:pPr>
+              <w:spacing w:before="0" w:after="0" w:line="322" w:lineRule="exact"/>
+              <w:ind w:left="0" w:firstLine="0"/>
+              <w:jc w:val="left"/>
+            </w:pPr>
+          </w:p>
+        </w:tc>
+        <w:tc>
+          <w:tcPr>
+            <w:tcW w:w="144" w:type="dxa"/>
+          </w:tcPr>
+          <w:p>
+            <w:pPr>
+              <w:spacing w:before="0" w:after="0" w:line="322" w:lineRule="exact"/>
+              <w:ind w:left="0" w:firstLine="0"/>
+              <w:jc w:val="left"/>
+            </w:pPr>
+          </w:p>
+        </w:tc>
+        <w:tc>
+          <w:tcPr>
+            <w:tcW w:w="3528" w:type="dxa"/>
+          </w:tcPr>
+          <w:p>
+            <w:pPr>
+              <w:spacing w:before="0" w:after="0" w:line="322" w:lineRule="exact"/>
+              <w:ind w:left="0" w:firstLine="0"/>
+              <w:jc w:val="left"/>
+            </w:pPr>
+          </w:p>
+        </w:tc>
+      </w:tr>
+      <w:tr>
+        <w:trPr>
+          <w:cantSplit/>
+        </w:trPr>
+        <w:tc>
+          <w:tcPr>
+            <w:tcW w:w="5688" w:type="dxa"/>
+          </w:tcPr>
+          <w:p>
+            <w:pPr>
+              <w:spacing w:before="0" w:after="0" w:line="322" w:lineRule="exact"/>
+              <w:ind w:left="0" w:firstLine="0"/>
+              <w:jc w:val="left"/>
             </w:pPr>
             <w:r>
               <w:t xml:space="preserve">JULIAN RODNEY ROOKS, JR,</w:t>
             </w:r>
           </w:p>
-          <w:p>
-            <w:pPr>
-              <w:spacing w:before="0" w:after="0" w:line="308" w:lineRule="exact"/>
-              <w:ind w:left="0" w:firstLine="0"/>
-            </w:pPr>
-          </w:p>
-          <w:p>
-            <w:pPr>
-              <w:spacing w:before="0" w:after="0" w:line="308" w:lineRule="exact"/>
-              <w:ind w:left="0" w:firstLine="0"/>
+        </w:tc>
+        <w:tc>
+          <w:tcPr>
+            <w:tcW w:w="144" w:type="dxa"/>
+          </w:tcPr>
+          <w:p>
+            <w:pPr>
+              <w:spacing w:before="0" w:after="0" w:line="322" w:lineRule="exact"/>
+              <w:ind w:left="0" w:firstLine="0"/>
+              <w:jc w:val="left"/>
+            </w:pPr>
+          </w:p>
+        </w:tc>
+        <w:tc>
+          <w:tcPr>
+            <w:tcW w:w="3528" w:type="dxa"/>
+          </w:tcPr>
+          <w:p>
+            <w:pPr>
+              <w:spacing w:before="0" w:after="0" w:line="322" w:lineRule="exact"/>
+              <w:ind w:left="0" w:firstLine="0"/>
+              <w:jc w:val="left"/>
+            </w:pPr>
+            <w:r>
+              <w:t xml:space="preserve">Case No. 16</w:t>
+              <w:noBreakHyphen/>
+              <w:t xml:space="preserve">40025-KKS</w:t>
+            </w:r>
+          </w:p>
+        </w:tc>
+      </w:tr>
+      <w:tr>
+        <w:trPr>
+          <w:cantSplit/>
+        </w:trPr>
+        <w:tc>
+          <w:tcPr>
+            <w:tcW w:w="5688" w:type="dxa"/>
+          </w:tcPr>
+          <w:p>
+            <w:pPr>
+              <w:spacing w:before="0" w:after="0" w:line="322" w:lineRule="exact"/>
+              <w:ind w:left="0" w:firstLine="0"/>
+              <w:jc w:val="left"/>
+            </w:pPr>
+          </w:p>
+        </w:tc>
+        <w:tc>
+          <w:tcPr>
+            <w:tcW w:w="144" w:type="dxa"/>
+          </w:tcPr>
+          <w:p>
+            <w:pPr>
+              <w:spacing w:before="0" w:after="0" w:line="322" w:lineRule="exact"/>
+              <w:ind w:left="0" w:firstLine="0"/>
+              <w:jc w:val="left"/>
+            </w:pPr>
+          </w:p>
+        </w:tc>
+        <w:tc>
+          <w:tcPr>
+            <w:tcW w:w="3528" w:type="dxa"/>
+          </w:tcPr>
+          <w:p>
+            <w:pPr>
+              <w:spacing w:before="0" w:after="0" w:line="322" w:lineRule="exact"/>
+              <w:ind w:left="0" w:firstLine="0"/>
+              <w:jc w:val="left"/>
+            </w:pPr>
+            <w:r>
+              <w:t xml:space="preserve">Chapter 7</w:t>
+            </w:r>
+          </w:p>
+        </w:tc>
+      </w:tr>
+      <w:tr>
+        <w:trPr>
+          <w:cantSplit/>
+        </w:trPr>
+        <w:tc>
+          <w:tcPr>
+            <w:tcW w:w="5688" w:type="dxa"/>
+          </w:tcPr>
+          <w:p>
+            <w:pPr>
+              <w:spacing w:before="0" w:after="0" w:line="322" w:lineRule="exact"/>
+              <w:ind w:left="0" w:firstLine="0"/>
+              <w:jc w:val="left"/>
             </w:pPr>
             <w:r>
               <w:t xml:space="preserve">Debtor.</w:t>
             </w:r>
           </w:p>
-          <w:p>
-            <w:pPr>
-              <w:spacing w:before="0" w:after="0" w:line="308" w:lineRule="exact"/>
-              <w:ind w:left="0" w:firstLine="0"/>
+        </w:tc>
+        <w:tc>
+          <w:tcPr>
+            <w:tcW w:w="144" w:type="dxa"/>
+          </w:tcPr>
+          <w:p>
+            <w:pPr>
+              <w:spacing w:before="0" w:after="0" w:line="322" w:lineRule="exact"/>
+              <w:ind w:left="0" w:firstLine="0"/>
+              <w:jc w:val="left"/>
+            </w:pPr>
+          </w:p>
+        </w:tc>
+        <w:tc>
+          <w:tcPr>
+            <w:tcW w:w="3528" w:type="dxa"/>
+          </w:tcPr>
+          <w:p>
+            <w:pPr>
+              <w:spacing w:before="0" w:after="0" w:line="322" w:lineRule="exact"/>
+              <w:ind w:left="0" w:firstLine="0"/>
+              <w:jc w:val="left"/>
+            </w:pPr>
+          </w:p>
+        </w:tc>
+      </w:tr>
+      <w:tr>
+        <w:trPr>
+          <w:cantSplit/>
+        </w:trPr>
+        <w:tc>
+          <w:tcPr>
+            <w:tcW w:w="5688" w:type="dxa"/>
+          </w:tcPr>
+          <w:p>
+            <w:pPr>
+              <w:spacing w:before="0" w:after="0" w:line="322" w:lineRule="exact"/>
+              <w:ind w:left="0" w:firstLine="0"/>
+              <w:jc w:val="left"/>
             </w:pPr>
             <w:r>
               <w:t xml:space="preserve">_______________________________________/</w:t>
@@ -117,186 +292,604 @@
         </w:tc>
         <w:tc>
           <w:tcPr>
-            <w:tcW w:w="280" w:type="dxa"/>
-          </w:tcPr>
-          <w:p>
-            <w:pPr>
-              <w:spacing w:before="0" w:after="0" w:line="308" w:lineRule="exact"/>
-              <w:ind w:left="0" w:firstLine="0"/>
-            </w:pPr>
-          </w:p>
-        </w:tc>
-        <w:tc>
-          <w:tcPr>
-            <w:tcW w:w="3274" w:type="dxa"/>
-          </w:tcPr>
-          <w:p>
-            <w:pPr>
-              <w:spacing w:before="0" w:after="0" w:line="308" w:lineRule="exact"/>
-              <w:ind w:left="0" w:firstLine="0"/>
-            </w:pPr>
-          </w:p>
-          <w:p>
-            <w:pPr>
-              <w:spacing w:before="0" w:after="0" w:line="308" w:lineRule="exact"/>
-              <w:ind w:left="0" w:firstLine="0"/>
-            </w:pPr>
-          </w:p>
-          <w:p>
-            <w:pPr>
-              <w:spacing w:before="0" w:after="0" w:line="308" w:lineRule="exact"/>
-              <w:ind w:left="0" w:firstLine="0"/>
-            </w:pPr>
-            <w:r>
-              <w:t xml:space="preserve">Case No. 16-40025-KKS</w:t>
-            </w:r>
-          </w:p>
-          <w:p>
-            <w:pPr>
-              <w:spacing w:before="0" w:after="0" w:line="308" w:lineRule="exact"/>
-              <w:ind w:left="0" w:firstLine="0"/>
-            </w:pPr>
-            <w:r>
-              <w:t xml:space="preserve">Chapter 7</w:t>
-            </w:r>
+            <w:tcW w:w="144" w:type="dxa"/>
+          </w:tcPr>
+          <w:p>
+            <w:pPr>
+              <w:spacing w:before="0" w:after="0" w:line="322" w:lineRule="exact"/>
+              <w:ind w:left="0" w:firstLine="0"/>
+              <w:jc w:val="left"/>
+            </w:pPr>
+          </w:p>
+        </w:tc>
+        <w:tc>
+          <w:tcPr>
+            <w:tcW w:w="3528" w:type="dxa"/>
+          </w:tcPr>
+          <w:p>
+            <w:pPr>
+              <w:spacing w:before="0" w:after="0" w:line="322" w:lineRule="exact"/>
+              <w:ind w:left="0" w:firstLine="0"/>
+              <w:jc w:val="left"/>
+            </w:pPr>
           </w:p>
         </w:tc>
       </w:tr>
-    </w:tbl>
-    <w:p>
-      <w:pPr>
-        <w:spacing w:before="0" w:after="0" w:line="616" w:lineRule="exact"/>
-        <w:ind w:left="0" w:firstLine="0"/>
-      </w:pPr>
-    </w:p>
-    <w:tbl>
-      <w:tblPr>
-        <w:tblW w:w="9360" w:type="dxa"/>
-        <w:tblBorders>
-          <w:top w:val="nil"/>
-          <w:left w:val="nil"/>
-          <w:bottom w:val="nil"/>
-          <w:right w:val="nil"/>
-          <w:insideH w:val="nil"/>
-          <w:insideV w:val="nil"/>
-        </w:tblBorders>
-        <w:tblLayout w:type="fixed"/>
-        <w:tblCellMar>
-          <w:left w:w="0" w:type="dxa"/>
-          <w:right w:w="0" w:type="dxa"/>
-        </w:tblCellMar>
-        <w:tblLook w:val="0000"/>
-      </w:tblPr>
-      <w:tblGrid>
-        <w:gridCol w:w="5806"/>
-        <w:gridCol w:w="280"/>
-        <w:gridCol w:w="3274"/>
-      </w:tblGrid>
       <w:tr>
-        <w:tc>
-          <w:tcPr>
-            <w:tcW w:w="5806" w:type="dxa"/>
-          </w:tcPr>
-          <w:p>
-            <w:pPr>
-              <w:spacing w:before="0" w:after="0" w:line="308" w:lineRule="exact"/>
-              <w:ind w:left="0" w:firstLine="0"/>
+        <w:trPr>
+          <w:cantSplit/>
+        </w:trPr>
+        <w:tc>
+          <w:tcPr>
+            <w:tcW w:w="5688" w:type="dxa"/>
+          </w:tcPr>
+          <w:p>
+            <w:pPr>
+              <w:spacing w:before="0" w:after="0" w:line="322" w:lineRule="exact"/>
+              <w:ind w:left="0" w:firstLine="0"/>
+              <w:jc w:val="left"/>
+            </w:pPr>
+          </w:p>
+        </w:tc>
+        <w:tc>
+          <w:tcPr>
+            <w:tcW w:w="144" w:type="dxa"/>
+          </w:tcPr>
+          <w:p>
+            <w:pPr>
+              <w:spacing w:before="0" w:after="0" w:line="322" w:lineRule="exact"/>
+              <w:ind w:left="0" w:firstLine="0"/>
+              <w:jc w:val="left"/>
+            </w:pPr>
+          </w:p>
+        </w:tc>
+        <w:tc>
+          <w:tcPr>
+            <w:tcW w:w="3528" w:type="dxa"/>
+          </w:tcPr>
+          <w:p>
+            <w:pPr>
+              <w:spacing w:before="0" w:after="0" w:line="322" w:lineRule="exact"/>
+              <w:ind w:left="0" w:firstLine="0"/>
+              <w:jc w:val="left"/>
+            </w:pPr>
+          </w:p>
+        </w:tc>
+      </w:tr>
+      <w:tr>
+        <w:trPr>
+          <w:cantSplit/>
+        </w:trPr>
+        <w:tc>
+          <w:tcPr>
+            <w:tcW w:w="5688" w:type="dxa"/>
+          </w:tcPr>
+          <w:p>
+            <w:pPr>
+              <w:spacing w:before="0" w:after="0" w:line="322" w:lineRule="exact"/>
+              <w:ind w:left="0" w:firstLine="0"/>
+              <w:jc w:val="left"/>
             </w:pPr>
             <w:r>
               <w:t xml:space="preserve">JULIAN RODNEY ROOKS, JR., &amp;</w:t>
             </w:r>
           </w:p>
-          <w:p>
-            <w:pPr>
-              <w:spacing w:before="0" w:after="0" w:line="308" w:lineRule="exact"/>
-              <w:ind w:left="0" w:firstLine="0"/>
+        </w:tc>
+        <w:tc>
+          <w:tcPr>
+            <w:tcW w:w="144" w:type="dxa"/>
+          </w:tcPr>
+          <w:p>
+            <w:pPr>
+              <w:spacing w:before="0" w:after="0" w:line="322" w:lineRule="exact"/>
+              <w:ind w:left="0" w:firstLine="0"/>
+              <w:jc w:val="left"/>
+            </w:pPr>
+          </w:p>
+        </w:tc>
+        <w:tc>
+          <w:tcPr>
+            <w:tcW w:w="3528" w:type="dxa"/>
+          </w:tcPr>
+          <w:p>
+            <w:pPr>
+              <w:spacing w:before="0" w:after="0" w:line="322" w:lineRule="exact"/>
+              <w:ind w:left="0" w:firstLine="0"/>
+              <w:jc w:val="left"/>
+            </w:pPr>
+          </w:p>
+        </w:tc>
+      </w:tr>
+      <w:tr>
+        <w:trPr>
+          <w:cantSplit/>
+        </w:trPr>
+        <w:tc>
+          <w:tcPr>
+            <w:tcW w:w="5688" w:type="dxa"/>
+          </w:tcPr>
+          <w:p>
+            <w:pPr>
+              <w:spacing w:before="0" w:after="0" w:line="322" w:lineRule="exact"/>
+              <w:ind w:left="0" w:firstLine="0"/>
+              <w:jc w:val="left"/>
             </w:pPr>
             <w:r>
               <w:t xml:space="preserve">BARBARA ROOKS,</w:t>
             </w:r>
           </w:p>
-          <w:p>
-            <w:pPr>
-              <w:spacing w:before="0" w:after="0" w:line="308" w:lineRule="exact"/>
-              <w:ind w:left="0" w:firstLine="0"/>
-            </w:pPr>
-          </w:p>
-          <w:p>
-            <w:pPr>
-              <w:spacing w:before="0" w:after="0" w:line="308" w:lineRule="exact"/>
-              <w:ind w:left="0" w:firstLine="0"/>
+        </w:tc>
+        <w:tc>
+          <w:tcPr>
+            <w:tcW w:w="144" w:type="dxa"/>
+          </w:tcPr>
+          <w:p>
+            <w:pPr>
+              <w:spacing w:before="0" w:after="0" w:line="322" w:lineRule="exact"/>
+              <w:ind w:left="0" w:firstLine="0"/>
+              <w:jc w:val="left"/>
+            </w:pPr>
+          </w:p>
+        </w:tc>
+        <w:tc>
+          <w:tcPr>
+            <w:tcW w:w="3528" w:type="dxa"/>
+          </w:tcPr>
+          <w:p>
+            <w:pPr>
+              <w:spacing w:before="0" w:after="0" w:line="322" w:lineRule="exact"/>
+              <w:ind w:left="0" w:firstLine="0"/>
+              <w:jc w:val="left"/>
+            </w:pPr>
+          </w:p>
+        </w:tc>
+      </w:tr>
+      <w:tr>
+        <w:trPr>
+          <w:cantSplit/>
+        </w:trPr>
+        <w:tc>
+          <w:tcPr>
+            <w:tcW w:w="5688" w:type="dxa"/>
+          </w:tcPr>
+          <w:p>
+            <w:pPr>
+              <w:spacing w:before="0" w:after="0" w:line="322" w:lineRule="exact"/>
+              <w:ind w:left="0" w:firstLine="0"/>
+              <w:jc w:val="left"/>
+            </w:pPr>
+          </w:p>
+        </w:tc>
+        <w:tc>
+          <w:tcPr>
+            <w:tcW w:w="144" w:type="dxa"/>
+          </w:tcPr>
+          <w:p>
+            <w:pPr>
+              <w:spacing w:before="0" w:after="0" w:line="322" w:lineRule="exact"/>
+              <w:ind w:left="0" w:firstLine="0"/>
+              <w:jc w:val="left"/>
+            </w:pPr>
+          </w:p>
+        </w:tc>
+        <w:tc>
+          <w:tcPr>
+            <w:tcW w:w="3528" w:type="dxa"/>
+          </w:tcPr>
+          <w:p>
+            <w:pPr>
+              <w:spacing w:before="0" w:after="0" w:line="322" w:lineRule="exact"/>
+              <w:ind w:left="0" w:firstLine="0"/>
+              <w:jc w:val="left"/>
+            </w:pPr>
+            <w:r>
+              <w:t xml:space="preserve">Adv. Pro. No. 16</w:t>
+              <w:noBreakHyphen/>
+              <w:t xml:space="preserve">04003-KKS</w:t>
+            </w:r>
+          </w:p>
+        </w:tc>
+      </w:tr>
+      <w:tr>
+        <w:trPr>
+          <w:cantSplit/>
+        </w:trPr>
+        <w:tc>
+          <w:tcPr>
+            <w:tcW w:w="5688" w:type="dxa"/>
+          </w:tcPr>
+          <w:p>
+            <w:pPr>
+              <w:spacing w:before="0" w:after="0" w:line="322" w:lineRule="exact"/>
+              <w:ind w:left="0" w:firstLine="0"/>
+              <w:jc w:val="left"/>
             </w:pPr>
             <w:r>
               <w:t xml:space="preserve">Plaintiffs,</w:t>
             </w:r>
           </w:p>
-          <w:p>
-            <w:pPr>
-              <w:spacing w:before="0" w:after="0" w:line="308" w:lineRule="exact"/>
-              <w:ind w:left="0" w:firstLine="0"/>
-            </w:pPr>
-          </w:p>
-          <w:p>
-            <w:pPr>
-              <w:spacing w:before="0" w:after="0" w:line="308" w:lineRule="exact"/>
-              <w:ind w:left="0" w:firstLine="0"/>
+        </w:tc>
+        <w:tc>
+          <w:tcPr>
+            <w:tcW w:w="144" w:type="dxa"/>
+          </w:tcPr>
+          <w:p>
+            <w:pPr>
+              <w:spacing w:before="0" w:after="0" w:line="322" w:lineRule="exact"/>
+              <w:ind w:left="0" w:firstLine="0"/>
+              <w:jc w:val="left"/>
+            </w:pPr>
+          </w:p>
+        </w:tc>
+        <w:tc>
+          <w:tcPr>
+            <w:tcW w:w="3528" w:type="dxa"/>
+          </w:tcPr>
+          <w:p>
+            <w:pPr>
+              <w:spacing w:before="0" w:after="0" w:line="322" w:lineRule="exact"/>
+              <w:ind w:left="0" w:firstLine="0"/>
+              <w:jc w:val="left"/>
+            </w:pPr>
+          </w:p>
+        </w:tc>
+      </w:tr>
+      <w:tr>
+        <w:trPr>
+          <w:cantSplit/>
+        </w:trPr>
+        <w:tc>
+          <w:tcPr>
+            <w:tcW w:w="5688" w:type="dxa"/>
+          </w:tcPr>
+          <w:p>
+            <w:pPr>
+              <w:spacing w:before="0" w:after="0" w:line="322" w:lineRule="exact"/>
+              <w:ind w:left="0" w:firstLine="0"/>
+              <w:jc w:val="left"/>
+            </w:pPr>
+          </w:p>
+        </w:tc>
+        <w:tc>
+          <w:tcPr>
+            <w:tcW w:w="144" w:type="dxa"/>
+          </w:tcPr>
+          <w:p>
+            <w:pPr>
+              <w:spacing w:before="0" w:after="0" w:line="322" w:lineRule="exact"/>
+              <w:ind w:left="0" w:firstLine="0"/>
+              <w:jc w:val="left"/>
+            </w:pPr>
+          </w:p>
+        </w:tc>
+        <w:tc>
+          <w:tcPr>
+            <w:tcW w:w="3528" w:type="dxa"/>
+          </w:tcPr>
+          <w:p>
+            <w:pPr>
+              <w:spacing w:before="0" w:after="0" w:line="322" w:lineRule="exact"/>
+              <w:ind w:left="0" w:firstLine="0"/>
+              <w:jc w:val="left"/>
+            </w:pPr>
+          </w:p>
+        </w:tc>
+      </w:tr>
+      <w:tr>
+        <w:trPr>
+          <w:cantSplit/>
+        </w:trPr>
+        <w:tc>
+          <w:tcPr>
+            <w:tcW w:w="5688" w:type="dxa"/>
+          </w:tcPr>
+          <w:p>
+            <w:pPr>
+              <w:spacing w:before="0" w:after="0" w:line="322" w:lineRule="exact"/>
+              <w:ind w:left="0" w:firstLine="0"/>
+              <w:jc w:val="left"/>
             </w:pPr>
             <w:r>
               <w:t xml:space="preserve">vs.</w:t>
             </w:r>
           </w:p>
-          <w:p>
-            <w:pPr>
-              <w:spacing w:before="0" w:after="0" w:line="308" w:lineRule="exact"/>
-              <w:ind w:left="0" w:firstLine="0"/>
-            </w:pPr>
-          </w:p>
-          <w:p>
-            <w:pPr>
-              <w:spacing w:before="0" w:after="0" w:line="308" w:lineRule="exact"/>
-              <w:ind w:left="0" w:firstLine="0"/>
+        </w:tc>
+        <w:tc>
+          <w:tcPr>
+            <w:tcW w:w="144" w:type="dxa"/>
+          </w:tcPr>
+          <w:p>
+            <w:pPr>
+              <w:spacing w:before="0" w:after="0" w:line="322" w:lineRule="exact"/>
+              <w:ind w:left="0" w:firstLine="0"/>
+              <w:jc w:val="left"/>
+            </w:pPr>
+          </w:p>
+        </w:tc>
+        <w:tc>
+          <w:tcPr>
+            <w:tcW w:w="3528" w:type="dxa"/>
+          </w:tcPr>
+          <w:p>
+            <w:pPr>
+              <w:spacing w:before="0" w:after="0" w:line="322" w:lineRule="exact"/>
+              <w:ind w:left="0" w:firstLine="0"/>
+              <w:jc w:val="left"/>
+            </w:pPr>
+          </w:p>
+        </w:tc>
+      </w:tr>
+      <w:tr>
+        <w:trPr>
+          <w:cantSplit/>
+        </w:trPr>
+        <w:tc>
+          <w:tcPr>
+            <w:tcW w:w="5688" w:type="dxa"/>
+          </w:tcPr>
+          <w:p>
+            <w:pPr>
+              <w:spacing w:before="0" w:after="0" w:line="322" w:lineRule="exact"/>
+              <w:ind w:left="0" w:firstLine="0"/>
+              <w:jc w:val="left"/>
+            </w:pPr>
+          </w:p>
+        </w:tc>
+        <w:tc>
+          <w:tcPr>
+            <w:tcW w:w="144" w:type="dxa"/>
+          </w:tcPr>
+          <w:p>
+            <w:pPr>
+              <w:spacing w:before="0" w:after="0" w:line="322" w:lineRule="exact"/>
+              <w:ind w:left="0" w:firstLine="0"/>
+              <w:jc w:val="left"/>
+            </w:pPr>
+          </w:p>
+        </w:tc>
+        <w:tc>
+          <w:tcPr>
+            <w:tcW w:w="3528" w:type="dxa"/>
+          </w:tcPr>
+          <w:p>
+            <w:pPr>
+              <w:spacing w:before="0" w:after="0" w:line="322" w:lineRule="exact"/>
+              <w:ind w:left="0" w:firstLine="0"/>
+              <w:jc w:val="left"/>
+            </w:pPr>
+          </w:p>
+        </w:tc>
+      </w:tr>
+      <w:tr>
+        <w:trPr>
+          <w:cantSplit/>
+        </w:trPr>
+        <w:tc>
+          <w:tcPr>
+            <w:tcW w:w="5688" w:type="dxa"/>
+          </w:tcPr>
+          <w:p>
+            <w:pPr>
+              <w:spacing w:before="0" w:after="0" w:line="322" w:lineRule="exact"/>
+              <w:ind w:left="0" w:firstLine="0"/>
+              <w:jc w:val="left"/>
             </w:pPr>
             <w:r>
               <w:t xml:space="preserve">EQUINOX CAPITAL, LICENSED BY</w:t>
             </w:r>
           </w:p>
-          <w:p>
-            <w:pPr>
-              <w:spacing w:before="0" w:after="0" w:line="308" w:lineRule="exact"/>
-              <w:ind w:left="0" w:firstLine="0"/>
+        </w:tc>
+        <w:tc>
+          <w:tcPr>
+            <w:tcW w:w="144" w:type="dxa"/>
+          </w:tcPr>
+          <w:p>
+            <w:pPr>
+              <w:spacing w:before="0" w:after="0" w:line="322" w:lineRule="exact"/>
+              <w:ind w:left="0" w:firstLine="0"/>
+              <w:jc w:val="left"/>
+            </w:pPr>
+          </w:p>
+        </w:tc>
+        <w:tc>
+          <w:tcPr>
+            <w:tcW w:w="3528" w:type="dxa"/>
+          </w:tcPr>
+          <w:p>
+            <w:pPr>
+              <w:spacing w:before="0" w:after="0" w:line="322" w:lineRule="exact"/>
+              <w:ind w:left="0" w:firstLine="0"/>
+              <w:jc w:val="left"/>
+            </w:pPr>
+          </w:p>
+        </w:tc>
+      </w:tr>
+      <w:tr>
+        <w:trPr>
+          <w:cantSplit/>
+        </w:trPr>
+        <w:tc>
+          <w:tcPr>
+            <w:tcW w:w="5688" w:type="dxa"/>
+          </w:tcPr>
+          <w:p>
+            <w:pPr>
+              <w:spacing w:before="0" w:after="0" w:line="322" w:lineRule="exact"/>
+              <w:ind w:left="0" w:firstLine="0"/>
+              <w:jc w:val="left"/>
             </w:pPr>
             <w:r>
               <w:t xml:space="preserve">THE UNITED STATES SMALL</w:t>
             </w:r>
           </w:p>
-          <w:p>
-            <w:pPr>
-              <w:spacing w:before="0" w:after="0" w:line="308" w:lineRule="exact"/>
-              <w:ind w:left="0" w:firstLine="0"/>
+        </w:tc>
+        <w:tc>
+          <w:tcPr>
+            <w:tcW w:w="144" w:type="dxa"/>
+          </w:tcPr>
+          <w:p>
+            <w:pPr>
+              <w:spacing w:before="0" w:after="0" w:line="322" w:lineRule="exact"/>
+              <w:ind w:left="0" w:firstLine="0"/>
+              <w:jc w:val="left"/>
+            </w:pPr>
+          </w:p>
+        </w:tc>
+        <w:tc>
+          <w:tcPr>
+            <w:tcW w:w="3528" w:type="dxa"/>
+          </w:tcPr>
+          <w:p>
+            <w:pPr>
+              <w:spacing w:before="0" w:after="0" w:line="322" w:lineRule="exact"/>
+              <w:ind w:left="0" w:firstLine="0"/>
+              <w:jc w:val="left"/>
+            </w:pPr>
+          </w:p>
+        </w:tc>
+      </w:tr>
+      <w:tr>
+        <w:trPr>
+          <w:cantSplit/>
+        </w:trPr>
+        <w:tc>
+          <w:tcPr>
+            <w:tcW w:w="5688" w:type="dxa"/>
+          </w:tcPr>
+          <w:p>
+            <w:pPr>
+              <w:spacing w:before="0" w:after="0" w:line="322" w:lineRule="exact"/>
+              <w:ind w:left="0" w:firstLine="0"/>
+              <w:jc w:val="left"/>
             </w:pPr>
             <w:r>
               <w:t xml:space="preserve">BUSINESS ADMINISTRATION, et al,</w:t>
             </w:r>
           </w:p>
-          <w:p>
-            <w:pPr>
-              <w:spacing w:before="0" w:after="0" w:line="308" w:lineRule="exact"/>
-              <w:ind w:left="0" w:firstLine="0"/>
-            </w:pPr>
-          </w:p>
-          <w:p>
-            <w:pPr>
-              <w:spacing w:before="0" w:after="0" w:line="308" w:lineRule="exact"/>
-              <w:ind w:left="0" w:firstLine="0"/>
+        </w:tc>
+        <w:tc>
+          <w:tcPr>
+            <w:tcW w:w="144" w:type="dxa"/>
+          </w:tcPr>
+          <w:p>
+            <w:pPr>
+              <w:spacing w:before="0" w:after="0" w:line="322" w:lineRule="exact"/>
+              <w:ind w:left="0" w:firstLine="0"/>
+              <w:jc w:val="left"/>
+            </w:pPr>
+          </w:p>
+        </w:tc>
+        <w:tc>
+          <w:tcPr>
+            <w:tcW w:w="3528" w:type="dxa"/>
+          </w:tcPr>
+          <w:p>
+            <w:pPr>
+              <w:spacing w:before="0" w:after="0" w:line="322" w:lineRule="exact"/>
+              <w:ind w:left="0" w:firstLine="0"/>
+              <w:jc w:val="left"/>
+            </w:pPr>
+          </w:p>
+        </w:tc>
+      </w:tr>
+      <w:tr>
+        <w:trPr>
+          <w:cantSplit/>
+        </w:trPr>
+        <w:tc>
+          <w:tcPr>
+            <w:tcW w:w="5688" w:type="dxa"/>
+          </w:tcPr>
+          <w:p>
+            <w:pPr>
+              <w:spacing w:before="0" w:after="0" w:line="322" w:lineRule="exact"/>
+              <w:ind w:left="0" w:firstLine="0"/>
+              <w:jc w:val="left"/>
+            </w:pPr>
+          </w:p>
+        </w:tc>
+        <w:tc>
+          <w:tcPr>
+            <w:tcW w:w="144" w:type="dxa"/>
+          </w:tcPr>
+          <w:p>
+            <w:pPr>
+              <w:spacing w:before="0" w:after="0" w:line="322" w:lineRule="exact"/>
+              <w:ind w:left="0" w:firstLine="0"/>
+              <w:jc w:val="left"/>
+            </w:pPr>
+          </w:p>
+        </w:tc>
+        <w:tc>
+          <w:tcPr>
+            <w:tcW w:w="3528" w:type="dxa"/>
+          </w:tcPr>
+          <w:p>
+            <w:pPr>
+              <w:spacing w:before="0" w:after="0" w:line="322" w:lineRule="exact"/>
+              <w:ind w:left="0" w:firstLine="0"/>
+              <w:jc w:val="left"/>
+            </w:pPr>
+          </w:p>
+        </w:tc>
+      </w:tr>
+      <w:tr>
+        <w:trPr>
+          <w:cantSplit/>
+        </w:trPr>
+        <w:tc>
+          <w:tcPr>
+            <w:tcW w:w="5688" w:type="dxa"/>
+          </w:tcPr>
+          <w:p>
+            <w:pPr>
+              <w:spacing w:before="0" w:after="0" w:line="322" w:lineRule="exact"/>
+              <w:ind w:left="0" w:firstLine="0"/>
+              <w:jc w:val="left"/>
             </w:pPr>
             <w:r>
               <w:t xml:space="preserve">Defendants.</w:t>
             </w:r>
           </w:p>
-          <w:p>
-            <w:pPr>
-              <w:spacing w:before="0" w:after="0" w:line="308" w:lineRule="exact"/>
-              <w:ind w:left="0" w:firstLine="0"/>
+        </w:tc>
+        <w:tc>
+          <w:tcPr>
+            <w:tcW w:w="144" w:type="dxa"/>
+          </w:tcPr>
+          <w:p>
+            <w:pPr>
+              <w:spacing w:before="0" w:after="0" w:line="322" w:lineRule="exact"/>
+              <w:ind w:left="0" w:firstLine="0"/>
+              <w:jc w:val="left"/>
+            </w:pPr>
+          </w:p>
+        </w:tc>
+        <w:tc>
+          <w:tcPr>
+            <w:tcW w:w="3528" w:type="dxa"/>
+          </w:tcPr>
+          <w:p>
+            <w:pPr>
+              <w:spacing w:before="0" w:after="0" w:line="322" w:lineRule="exact"/>
+              <w:ind w:left="0" w:firstLine="0"/>
+              <w:jc w:val="left"/>
+            </w:pPr>
+          </w:p>
+        </w:tc>
+      </w:tr>
+      <w:tr>
+        <w:trPr>
+          <w:cantSplit/>
+        </w:trPr>
+        <w:tc>
+          <w:tcPr>
+            <w:tcW w:w="5688" w:type="dxa"/>
+          </w:tcPr>
+          <w:p>
+            <w:pPr>
+              <w:spacing w:before="0" w:after="0" w:line="322" w:lineRule="exact"/>
+              <w:ind w:left="0" w:firstLine="0"/>
+              <w:jc w:val="left"/>
             </w:pPr>
             <w:r>
               <w:t xml:space="preserve">_______________________________________/</w:t>
@@ -305,52 +898,35 @@
         </w:tc>
         <w:tc>
           <w:tcPr>
-            <w:tcW w:w="280" w:type="dxa"/>
-          </w:tcPr>
-          <w:p>
-            <w:pPr>
-              <w:spacing w:before="0" w:after="0" w:line="308" w:lineRule="exact"/>
-              <w:ind w:left="0" w:firstLine="0"/>
-            </w:pPr>
-          </w:p>
-        </w:tc>
-        <w:tc>
-          <w:tcPr>
-            <w:tcW w:w="3274" w:type="dxa"/>
-          </w:tcPr>
-          <w:p>
-            <w:pPr>
-              <w:spacing w:before="0" w:after="0" w:line="308" w:lineRule="exact"/>
-              <w:ind w:left="0" w:firstLine="0"/>
-            </w:pPr>
-          </w:p>
-          <w:p>
-            <w:pPr>
-              <w:spacing w:before="0" w:after="0" w:line="308" w:lineRule="exact"/>
-              <w:ind w:left="0" w:firstLine="0"/>
-            </w:pPr>
-          </w:p>
-          <w:p>
-            <w:pPr>
-              <w:spacing w:before="0" w:after="0" w:line="308" w:lineRule="exact"/>
-              <w:ind w:left="0" w:firstLine="0"/>
-            </w:pPr>
-            <w:r>
-              <w:t xml:space="preserve">Adv. Pro. No. 16-04003-KKS</w:t>
-            </w:r>
+            <w:tcW w:w="144" w:type="dxa"/>
+          </w:tcPr>
+          <w:p>
+            <w:pPr>
+              <w:spacing w:before="0" w:after="0" w:line="322" w:lineRule="exact"/>
+              <w:ind w:left="0" w:firstLine="0"/>
+              <w:jc w:val="left"/>
+            </w:pPr>
+          </w:p>
+        </w:tc>
+        <w:tc>
+          <w:tcPr>
+            <w:tcW w:w="3528" w:type="dxa"/>
+          </w:tcPr>
+          <w:p>
+            <w:pPr>
+              <w:spacing w:before="0" w:after="0" w:line="322" w:lineRule="exact"/>
+              <w:ind w:left="0" w:firstLine="0"/>
+              <w:jc w:val="left"/>
+            </w:pPr>
           </w:p>
         </w:tc>
       </w:tr>
     </w:tbl>
     <w:p>
       <w:pPr>
-        <w:spacing w:before="0" w:after="0" w:line="756" w:lineRule="exact"/>
-        <w:ind w:left="0" w:firstLine="0"/>
-      </w:pPr>
-    </w:p>
-    <w:p>
-      <w:pPr>
-        <w:spacing w:before="0" w:after="0" w:line="308" w:lineRule="exact"/>
+        <w:keepNext/>
+        <w:keepLines/>
+        <w:spacing w:before="644" w:after="0" w:line="322" w:lineRule="exact"/>
         <w:ind w:left="0" w:firstLine="0"/>
         <w:jc w:val="center"/>
       </w:pPr>
@@ -364,7 +940,9 @@
     </w:p>
     <w:p>
       <w:pPr>
-        <w:spacing w:before="0" w:after="0" w:line="308" w:lineRule="exact"/>
+        <w:keepNext/>
+        <w:keepLines/>
+        <w:spacing w:before="0" w:after="0" w:line="322" w:lineRule="exact"/>
         <w:ind w:left="0" w:firstLine="0"/>
         <w:jc w:val="center"/>
       </w:pPr>
@@ -378,7 +956,9 @@
     </w:p>
     <w:p>
       <w:pPr>
-        <w:spacing w:before="0" w:after="0" w:line="308" w:lineRule="exact"/>
+        <w:keepNext/>
+        <w:keepLines/>
+        <w:spacing w:before="0" w:after="322" w:line="322" w:lineRule="exact"/>
         <w:ind w:left="0" w:firstLine="0"/>
         <w:jc w:val="center"/>
       </w:pPr>
@@ -392,114 +972,153 @@
     </w:p>
     <w:p>
       <w:pPr>
-        <w:spacing w:before="0" w:after="0" w:line="756" w:lineRule="exact"/>
+        <w:pStyle w:val="BodyText"/>
+      </w:pPr>
+      <w:r>
+        <w:t xml:space="preserve">Defendant, GC SERVICES LIMITED PARTNERSHIP (</w:t>
+      </w:r>
+      <w:r>
+        <w:t xml:space="preserve">“GCS”</w:t>
+      </w:r>
+      <w:r>
+        <w:t xml:space="preserve">), by and through its undersigned counsel and pursuant to Rule 12(b)⁠(6) of the Federal Rules of Civil Procedure and Rule 7012 of the Federal Rules of Bankruptcy Procedure, hereby files this, its Motion to Dismiss the Complaint (D.E. #1 et seq) as to GC Services and Incorporated Memorandum of Law for failure to state a claim on which relief can be granted, and in support thereof states as follows:</w:t>
+      </w:r>
+    </w:p>
+    <w:p>
+      <w:pPr>
+        <w:pStyle w:val="BodyText"/>
+      </w:pPr>
+      <w:r>
+        <w:t xml:space="preserve">1. Plaintiff filed a 91 page complaint against sixty-six named defendants, including GC Services.</w:t>
+      </w:r>
+    </w:p>
+    <w:p>
+      <w:pPr>
+        <w:pStyle w:val="BodyText"/>
+      </w:pPr>
+      <w:r>
+        <w:t xml:space="preserve">2. A review of the Complaint reveals there is not one allegation directed to GC Services.</w:t>
+      </w:r>
+    </w:p>
+    <w:p>
+      <w:pPr>
+        <w:pStyle w:val="BodyText"/>
+      </w:pPr>
+      <w:r>
+        <w:t xml:space="preserve">3. In fact, the Complaint makes only two mentions of GCS: initially in the style of the case, and again in the section entitled</w:t>
+      </w:r>
+      <w:r>
+        <w:t xml:space="preserve"> </w:t>
+      </w:r>
+      <w:r>
+        <w:t xml:space="preserve">“Defendants”</w:t>
+      </w:r>
+      <w:r>
+        <w:t xml:space="preserve">, there is an allegation (albeit inaccurate) that GCS is a Florida corporation.</w:t>
+      </w:r>
+    </w:p>
+    <w:p>
+      <w:pPr>
+        <w:pStyle w:val="BodyText"/>
+      </w:pPr>
+      <w:r>
+        <w:t xml:space="preserve">4. GCS is not mentioned in any of the 91 pages that follow.</w:t>
+      </w:r>
+    </w:p>
+    <w:p>
+      <w:pPr>
+        <w:pStyle w:val="BodyText"/>
+      </w:pPr>
+      <w:r>
+        <w:t xml:space="preserve">5. Nor does there appear to be any exhibit that relates to GCS in the 271 pages of composite exhibits that follow the Complaint.</w:t>
+      </w:r>
+    </w:p>
+    <w:p>
+      <w:pPr>
+        <w:pStyle w:val="BodyText"/>
+      </w:pPr>
+      <w:r>
+        <w:t xml:space="preserve">6. As there are no operative allegations setting forth a claim on which relief can be granted as to GCS, GCS prays for the relief of dismissal of the Complaint as to GCS, as set forth more fully in the Memorandum of Law below.</w:t>
+      </w:r>
+    </w:p>
+    <w:p>
+      <w:pPr>
+        <w:pStyle w:val="BodyText"/>
+      </w:pPr>
+      <w:r>
+        <w:t xml:space="preserve">7. In the alternative, GCS adopts and joins in the Motion of Defendants Equinox Capital SBIC, L.P., R3 Education, Inc., St. Matthew’s University Inc, and St. Matthew’s University (Cayman) Ltd et al (</w:t>
+      </w:r>
+      <w:r>
+        <w:t xml:space="preserve">“St. Matthew’s Parties”</w:t>
+      </w:r>
+      <w:r>
+        <w:t xml:space="preserve">), for extension of time to file a responsive pleading or otherwise answer (D.E. 32), and reserves to itself and does not waive all rights, defenses, defects in jurisdiction, and defects in service of process as may exist with regard to GCS.</w:t>
+      </w:r>
+      <w:r>
+        <w:rPr>
+          <w:rStyle w:val="FootnoteReference"/>
+        </w:rPr>
+        <w:footnoteReference w:id="9"/>
+      </w:r>
+    </w:p>
+    <w:p>
+      <w:pPr>
+        <w:pStyle w:val="Heading2"/>
+        <w:keepNext/>
+        <w:keepLines/>
+        <w:spacing w:before="322" w:after="0" w:line="322" w:lineRule="exact"/>
         <w:ind w:left="0" w:firstLine="0"/>
-      </w:pPr>
-    </w:p>
-    <w:p>
-      <w:pPr>
-        <w:pStyle w:val="FirstParagraph"/>
-      </w:pPr>
-      <w:r>
-        <w:t xml:space="preserve">Defendant, GC SERVICES LIMITED PARTNERSHIP (</w:t>
-      </w:r>
-      <w:r>
-        <w:t xml:space="preserve">“GCS”</w:t>
-      </w:r>
-      <w:r>
-        <w:t xml:space="preserve">), by and through its undersigned counsel and pursuant to Rule 12(b)(6) of the Federal Rules of Civil Procedure and Rule 7012 of the Federal Rules of Bankruptcy Procedure, hereby files this, its Motion to Dismiss the Complaint (D.E. #1 et seq) as to GC Services and Incorporated Memorandum of Law for failure to state a claim on which relief can be granted, and in support thereof states as follows:</w:t>
+        <w:jc w:val="center"/>
+      </w:pPr>
+      <w:r>
+        <w:rPr>
+          <w:b/>
+          <w:bCs/>
+          <w:i w:val="0"/>
+          <w:iCs w:val="0"/>
+        </w:rPr>
+        <w:t xml:space="preserve">MEMORANDUM</w:t>
+      </w:r>
+      <w:r>
+        <w:rPr>
+          <w:b/>
+          <w:bCs/>
+          <w:i w:val="0"/>
+          <w:iCs w:val="0"/>
+        </w:rPr>
+        <w:t xml:space="preserve"> </w:t>
+      </w:r>
+      <w:r>
+        <w:rPr>
+          <w:b/>
+          <w:bCs/>
+          <w:i w:val="0"/>
+          <w:iCs w:val="0"/>
+        </w:rPr>
+        <w:t xml:space="preserve">OF</w:t>
+      </w:r>
+      <w:r>
+        <w:rPr>
+          <w:b/>
+          <w:bCs/>
+          <w:i w:val="0"/>
+          <w:iCs w:val="0"/>
+        </w:rPr>
+        <w:t xml:space="preserve"> </w:t>
+      </w:r>
+      <w:r>
+        <w:rPr>
+          <w:b/>
+          <w:bCs/>
+          <w:i w:val="0"/>
+          <w:iCs w:val="0"/>
+        </w:rPr>
+        <w:t xml:space="preserve">LAW</w:t>
       </w:r>
     </w:p>
     <w:p>
       <w:pPr>
         <w:pStyle w:val="BodyText"/>
-      </w:pPr>
-      <w:r>
-        <w:t xml:space="preserve">1. Plaintiff filed a 91 page complaint against sixty-six named defendants, including GC Services.</w:t>
-      </w:r>
-    </w:p>
-    <w:p>
-      <w:pPr>
-        <w:pStyle w:val="BodyText"/>
-      </w:pPr>
-      <w:r>
-        <w:t xml:space="preserve">2. A review of the Complaint reveals there is not one allegation directed to GC Services.</w:t>
-      </w:r>
-    </w:p>
-    <w:p>
-      <w:pPr>
-        <w:pStyle w:val="BodyText"/>
-      </w:pPr>
-      <w:r>
-        <w:t xml:space="preserve">3. In fact, the Complaint makes only two mentions of GCS: initially in the style of the case, and again in the section entitled</w:t>
-      </w:r>
-      <w:r>
-        <w:t xml:space="preserve"> </w:t>
-      </w:r>
-      <w:r>
-        <w:t xml:space="preserve">“Defendants”</w:t>
-      </w:r>
-      <w:r>
-        <w:t xml:space="preserve">, there is an allegation (albeit inaccurate) that GCS is a Florida corporation.</w:t>
-      </w:r>
-    </w:p>
-    <w:p>
-      <w:pPr>
-        <w:pStyle w:val="BodyText"/>
-      </w:pPr>
-      <w:r>
-        <w:t xml:space="preserve">4. GCS is not mentioned in any of the 91 pages that follow.</w:t>
-      </w:r>
-    </w:p>
-    <w:p>
-      <w:pPr>
-        <w:pStyle w:val="BodyText"/>
-      </w:pPr>
-      <w:r>
-        <w:t xml:space="preserve">5. Nor does there appear to be any exhibit that relates to GCS in the 271 pages of composite exhibits that follow the Complaint.</w:t>
-      </w:r>
-    </w:p>
-    <w:p>
-      <w:pPr>
-        <w:pStyle w:val="BodyText"/>
-      </w:pPr>
-      <w:r>
-        <w:t xml:space="preserve">6. As there are no operative allegations setting forth a claim on which relief can be granted as to GCS, GCS prays for the relief of dismissal of the Complaint as to GCS, as set forth more fully in the Memorandum of Law below.</w:t>
-      </w:r>
-    </w:p>
-    <w:p>
-      <w:pPr>
-        <w:pStyle w:val="BodyText"/>
-      </w:pPr>
-      <w:r>
-        <w:t xml:space="preserve">7. In the alternative, GCS adopts and joins in the Motion of Defendants Equinox Capital SBIC, L.P., R3 Education, Inc., St. Matthew’s University Inc, and St. Matthew’s University (Cayman) Ltd et al (</w:t>
-      </w:r>
-      <w:r>
-        <w:t xml:space="preserve">“St. Matthew’s Parties”</w:t>
-      </w:r>
-      <w:r>
-        <w:t xml:space="preserve">), for extension of time to file a responsive pleading or otherwise answer (D.E. 32), and reserves to itself and does not waive all rights, defenses, defects in jurisdiction, and defects in service of process as may exist with regard to GCS.</w:t>
-      </w:r>
-      <w:r>
-        <w:rPr>
-          <w:rStyle w:val="FootnoteReference"/>
-        </w:rPr>
-        <w:footnoteReference w:id="9"/>
-      </w:r>
-    </w:p>
-    <w:p>
-      <w:pPr>
-        <w:pStyle w:val="Heading2"/>
-      </w:pPr>
-      <w:bookmarkStart w:id="10" w:name="_cd83b0b34d4652a15b688c42fabcc913e2f2c3d"/>
-      <w:r>
-        <w:t xml:space="preserve">MEMORANDUM OF LAW</w:t>
-      </w:r>
-      <w:bookmarkEnd w:id="10"/>
-    </w:p>
-    <w:p>
-      <w:pPr>
-        <w:pStyle w:val="FirstParagraph"/>
       </w:pPr>
       <w:r>
         <w:t xml:space="preserve">The pleading standard of Rule 8 does not require detailed factual allegations, but it does</w:t>
@@ -547,28 +1166,229 @@
         <w:t xml:space="preserve">Id</w:t>
       </w:r>
       <w:r>
-        <w:t xml:space="preserve">, at 856 (</w:t>
-      </w:r>
-      <w:r>
-        <w:t xml:space="preserve">“Court’s duty to liberally construe a pro se litigant’s complaint”</w:t>
-      </w:r>
-      <w:r>
-        <w:t xml:space="preserve">in the face of a motion to dismiss is not the equivalent of a duty to re-write it….”). This Complaint makes no specific allegation of any discernible sort regarding GCS and should therefore be dismissed as to this Defendant.</w:t>
+        <w:t xml:space="preserve">, at 856 (“Court’s duty to liberally construe a pro se litigant’s complaint “in the face of a motion to dismiss is not the equivalent of a duty to re-write it….”). This Complaint makes no specific allegation of any discernible sort regarding GCS and should therefore be dismissed as to this Defendant.</w:t>
       </w:r>
     </w:p>
     <w:p>
       <w:pPr>
         <w:pStyle w:val="Heading2"/>
-      </w:pPr>
-      <w:bookmarkStart w:id="11" w:name="_da117bd3cb18aed561c150e72e3d6b3eca06a8c"/>
-      <w:r>
-        <w:t xml:space="preserve">CERTIFICATION OF GOOD FAITH ATTEMPT TO CONFER PER LOC. R. 7007-1</w:t>
-      </w:r>
-      <w:bookmarkEnd w:id="11"/>
-    </w:p>
-    <w:p>
-      <w:pPr>
-        <w:pStyle w:val="FirstParagraph"/>
+        <w:keepNext/>
+        <w:keepLines/>
+        <w:spacing w:before="322" w:after="0" w:line="322" w:lineRule="exact"/>
+        <w:ind w:left="0" w:firstLine="0"/>
+        <w:jc w:val="center"/>
+      </w:pPr>
+      <w:r>
+        <w:rPr>
+          <w:b/>
+          <w:bCs/>
+          <w:i w:val="0"/>
+          <w:iCs w:val="0"/>
+        </w:rPr>
+        <w:t xml:space="preserve">CERTIFICATION</w:t>
+      </w:r>
+      <w:r>
+        <w:rPr>
+          <w:b/>
+          <w:bCs/>
+          <w:i w:val="0"/>
+          <w:iCs w:val="0"/>
+        </w:rPr>
+        <w:t xml:space="preserve"> </w:t>
+      </w:r>
+      <w:r>
+        <w:rPr>
+          <w:b/>
+          <w:bCs/>
+          <w:i w:val="0"/>
+          <w:iCs w:val="0"/>
+        </w:rPr>
+        <w:t xml:space="preserve">OF</w:t>
+      </w:r>
+      <w:r>
+        <w:rPr>
+          <w:b/>
+          <w:bCs/>
+          <w:i w:val="0"/>
+          <w:iCs w:val="0"/>
+        </w:rPr>
+        <w:t xml:space="preserve"> </w:t>
+      </w:r>
+      <w:r>
+        <w:rPr>
+          <w:b/>
+          <w:bCs/>
+          <w:i w:val="0"/>
+          <w:iCs w:val="0"/>
+        </w:rPr>
+        <w:t xml:space="preserve">GOOD</w:t>
+      </w:r>
+      <w:r>
+        <w:rPr>
+          <w:b/>
+          <w:bCs/>
+          <w:i w:val="0"/>
+          <w:iCs w:val="0"/>
+        </w:rPr>
+        <w:t xml:space="preserve"> </w:t>
+      </w:r>
+      <w:r>
+        <w:rPr>
+          <w:b/>
+          <w:bCs/>
+          <w:i w:val="0"/>
+          <w:iCs w:val="0"/>
+        </w:rPr>
+        <w:t xml:space="preserve">FAITH</w:t>
+      </w:r>
+      <w:r>
+        <w:rPr>
+          <w:b/>
+          <w:bCs/>
+          <w:i w:val="0"/>
+          <w:iCs w:val="0"/>
+        </w:rPr>
+        <w:t xml:space="preserve"> </w:t>
+      </w:r>
+      <w:r>
+        <w:rPr>
+          <w:b/>
+          <w:bCs/>
+          <w:i w:val="0"/>
+          <w:iCs w:val="0"/>
+        </w:rPr>
+        <w:t xml:space="preserve">ATTEMPT</w:t>
+      </w:r>
+      <w:r>
+        <w:rPr>
+          <w:b/>
+          <w:bCs/>
+          <w:i w:val="0"/>
+          <w:iCs w:val="0"/>
+        </w:rPr>
+        <w:t xml:space="preserve"> </w:t>
+      </w:r>
+      <w:r>
+        <w:rPr>
+          <w:b/>
+          <w:bCs/>
+          <w:i w:val="0"/>
+          <w:iCs w:val="0"/>
+        </w:rPr>
+        <w:t xml:space="preserve">TO</w:t>
+      </w:r>
+      <w:r>
+        <w:rPr>
+          <w:b/>
+          <w:bCs/>
+          <w:i w:val="0"/>
+          <w:iCs w:val="0"/>
+        </w:rPr>
+        <w:t xml:space="preserve"> </w:t>
+      </w:r>
+      <w:r>
+        <w:rPr>
+          <w:b/>
+          <w:bCs/>
+          <w:i w:val="0"/>
+          <w:iCs w:val="0"/>
+        </w:rPr>
+        <w:t xml:space="preserve">CONFER</w:t>
+      </w:r>
+      <w:r>
+        <w:rPr>
+          <w:b/>
+          <w:bCs/>
+          <w:i w:val="0"/>
+          <w:iCs w:val="0"/>
+        </w:rPr>
+        <w:t xml:space="preserve"> </w:t>
+      </w:r>
+      <w:r>
+        <w:rPr>
+          <w:b/>
+          <w:bCs/>
+          <w:i w:val="0"/>
+          <w:iCs w:val="0"/>
+        </w:rPr>
+        <w:t xml:space="preserve">PER</w:t>
+      </w:r>
+      <w:r>
+        <w:rPr>
+          <w:b/>
+          <w:bCs/>
+          <w:i w:val="0"/>
+          <w:iCs w:val="0"/>
+        </w:rPr>
+        <w:t xml:space="preserve"> </w:t>
+      </w:r>
+      <w:r>
+        <w:rPr>
+          <w:b/>
+          <w:bCs/>
+          <w:i w:val="0"/>
+          <w:iCs w:val="0"/>
+        </w:rPr>
+        <w:t xml:space="preserve">LOC.</w:t>
+      </w:r>
+      <w:r>
+        <w:rPr>
+          <w:b/>
+          <w:bCs/>
+          <w:i w:val="0"/>
+          <w:iCs w:val="0"/>
+        </w:rPr>
+        <w:t xml:space="preserve"> </w:t>
+      </w:r>
+      <w:r>
+        <w:rPr>
+          <w:b/>
+          <w:bCs/>
+          <w:i w:val="0"/>
+          <w:iCs w:val="0"/>
+        </w:rPr>
+        <w:t xml:space="preserve">R.</w:t>
+      </w:r>
+      <w:r>
+        <w:rPr>
+          <w:b/>
+          <w:bCs/>
+          <w:i w:val="0"/>
+          <w:iCs w:val="0"/>
+        </w:rPr>
+        <w:t xml:space="preserve"> </w:t>
+      </w:r>
+      <w:r>
+        <w:rPr>
+          <w:b/>
+          <w:bCs/>
+          <w:i w:val="0"/>
+          <w:iCs w:val="0"/>
+        </w:rPr>
+        <w:t xml:space="preserve">7007</w:t>
+      </w:r>
+      <w:r>
+        <w:rPr>
+          <w:b/>
+          <w:bCs/>
+          <w:i w:val="0"/>
+          <w:iCs w:val="0"/>
+        </w:rPr>
+        <w:t xml:space="preserve">-⁠</w:t>
+      </w:r>
+      <w:r>
+        <w:rPr>
+          <w:b/>
+          <w:bCs/>
+          <w:i w:val="0"/>
+          <w:iCs w:val="0"/>
+        </w:rPr>
+        <w:t xml:space="preserve">1</w:t>
+      </w:r>
+    </w:p>
+    <w:p>
+      <w:pPr>
+        <w:pStyle w:val="BodyText"/>
       </w:pPr>
       <w:r>
         <w:t xml:space="preserve">The undersigned hereby certifies that he has attempted to confer in good faith with Plaintiffs using the phone number provided in the service block for the Complaint regarding the relief requested in this Motion, but that he was unable to confer with Plaintiffs regarding this Motion. Defendant believes this Motion can be disposed of without a hearing and does not request one, but should a hearing on this Motion be necessary or should Plaintiffs respond, Defendant anticipates no more than ten minutes would be necessary to present this motion.</w:t>
@@ -576,7 +1396,7 @@
     </w:p>
     <w:p>
       <w:pPr>
-        <w:pStyle w:val="KeepNext"/>
+        <w:pStyle w:val="BodyTextKeepNext"/>
       </w:pPr>
       <w:r>
         <w:t xml:space="preserve">WHEREFORE, Defendant GC SERVICES LIMITED PARTNERSHIP respectfully requests this honorable Court dismiss the Complaint of Plaintiffs as to GC SERVICES LIMITED PARTNERSHIP, and for such other and further relief as the Court deems just and proper.</w:t>
@@ -585,176 +1405,308 @@
     <w:p>
       <w:pPr>
         <w:keepNext/>
-        <w:spacing w:before="0" w:after="0" w:line="756" w:lineRule="exact"/>
+        <w:keepLines/>
+        <w:spacing w:before="322" w:after="0" w:line="322" w:lineRule="exact"/>
+        <w:ind w:left="4176" w:firstLine="0"/>
+        <w:jc w:val="left"/>
+      </w:pPr>
+      <w:r>
+        <w:t xml:space="preserve">Respectfully submitted,</w:t>
+      </w:r>
+    </w:p>
+    <w:p>
+      <w:pPr>
+        <w:keepNext/>
+        <w:keepLines/>
+        <w:spacing w:before="0" w:after="0" w:line="322" w:lineRule="exact"/>
+        <w:ind w:left="4176" w:firstLine="0"/>
+        <w:jc w:val="left"/>
+      </w:pPr>
+    </w:p>
+    <w:p>
+      <w:pPr>
+        <w:keepNext/>
+        <w:keepLines/>
+        <w:spacing w:before="0" w:after="0" w:line="322" w:lineRule="exact"/>
+        <w:ind w:left="4176" w:firstLine="0"/>
+        <w:jc w:val="left"/>
+      </w:pPr>
+    </w:p>
+    <w:p>
+      <w:pPr>
+        <w:keepNext/>
+        <w:keepLines/>
+        <w:spacing w:before="0" w:after="0" w:line="322" w:lineRule="exact"/>
+        <w:ind w:left="4176" w:firstLine="0"/>
+        <w:jc w:val="left"/>
+      </w:pPr>
+      <w:r>
+        <w:t xml:space="preserve">s/ Ruel W. Smith</w:t>
+      </w:r>
+    </w:p>
+    <w:p>
+      <w:pPr>
+        <w:keepNext/>
+        <w:keepLines/>
+        <w:spacing w:before="0" w:after="0" w:line="322" w:lineRule="exact"/>
+        <w:ind w:left="4176" w:firstLine="0"/>
+        <w:jc w:val="left"/>
+      </w:pPr>
+      <w:r>
+        <w:t xml:space="preserve">Ruel W. Smith</w:t>
+      </w:r>
+    </w:p>
+    <w:p>
+      <w:pPr>
+        <w:keepNext/>
+        <w:keepLines/>
+        <w:spacing w:before="0" w:after="0" w:line="322" w:lineRule="exact"/>
+        <w:ind w:left="4176" w:firstLine="0"/>
+        <w:jc w:val="left"/>
+      </w:pPr>
+      <w:r>
+        <w:t xml:space="preserve">Florida Bar No. 36548</w:t>
+      </w:r>
+    </w:p>
+    <w:p>
+      <w:pPr>
+        <w:keepNext/>
+        <w:keepLines/>
+        <w:spacing w:before="0" w:after="0" w:line="322" w:lineRule="exact"/>
+        <w:ind w:left="4176" w:firstLine="0"/>
+        <w:jc w:val="left"/>
+      </w:pPr>
+      <w:r>
+        <w:t xml:space="preserve">rsmith@hinshawlaw.com</w:t>
+      </w:r>
+    </w:p>
+    <w:p>
+      <w:pPr>
+        <w:keepNext/>
+        <w:keepLines/>
+        <w:spacing w:before="0" w:after="0" w:line="322" w:lineRule="exact"/>
+        <w:ind w:left="4176" w:firstLine="0"/>
+        <w:jc w:val="left"/>
+      </w:pPr>
+      <w:r>
+        <w:t xml:space="preserve">HINSHAW &amp; CULBERTSON LLP</w:t>
+      </w:r>
+    </w:p>
+    <w:p>
+      <w:pPr>
+        <w:keepNext/>
+        <w:keepLines/>
+        <w:spacing w:before="0" w:after="0" w:line="322" w:lineRule="exact"/>
+        <w:ind w:left="4176" w:firstLine="0"/>
+        <w:jc w:val="left"/>
+      </w:pPr>
+      <w:r>
+        <w:t xml:space="preserve">100 South Ashley Drive, Suite 500</w:t>
+      </w:r>
+    </w:p>
+    <w:p>
+      <w:pPr>
+        <w:keepNext/>
+        <w:keepLines/>
+        <w:spacing w:before="0" w:after="0" w:line="322" w:lineRule="exact"/>
+        <w:ind w:left="4176" w:firstLine="0"/>
+        <w:jc w:val="left"/>
+      </w:pPr>
+      <w:r>
+        <w:t xml:space="preserve">Tampa, FL 33602</w:t>
+      </w:r>
+    </w:p>
+    <w:p>
+      <w:pPr>
+        <w:keepNext/>
+        <w:keepLines/>
+        <w:spacing w:before="0" w:after="0" w:line="322" w:lineRule="exact"/>
+        <w:ind w:left="4176" w:firstLine="0"/>
+        <w:jc w:val="left"/>
+      </w:pPr>
+      <w:r>
+        <w:t xml:space="preserve">Telephone: 813</w:t>
+        <w:noBreakHyphen/>
+        <w:t xml:space="preserve">276</w:t>
+        <w:noBreakHyphen/>
+        <w:t xml:space="preserve">1662</w:t>
+      </w:r>
+    </w:p>
+    <w:p>
+      <w:pPr>
+        <w:keepNext/>
+        <w:keepLines/>
+        <w:spacing w:before="0" w:after="0" w:line="322" w:lineRule="exact"/>
+        <w:ind w:left="4176" w:firstLine="0"/>
+        <w:jc w:val="left"/>
+      </w:pPr>
+      <w:r>
+        <w:t xml:space="preserve">Facsimile: 813</w:t>
+        <w:noBreakHyphen/>
+        <w:t xml:space="preserve">276</w:t>
+        <w:noBreakHyphen/>
+        <w:t xml:space="preserve">1956</w:t>
+      </w:r>
+    </w:p>
+    <w:p>
+      <w:pPr>
+        <w:keepLines/>
+        <w:spacing w:before="0" w:after="0" w:line="322" w:lineRule="exact"/>
+        <w:ind w:left="4176" w:firstLine="0"/>
+        <w:jc w:val="left"/>
+      </w:pPr>
+      <w:r>
+        <w:t xml:space="preserve">Attorneys for the GC Services, Inc.</w:t>
+      </w:r>
+    </w:p>
+    <w:p>
+      <w:pPr>
+        <w:pStyle w:val="Heading2"/>
+        <w:keepNext/>
+        <w:keepLines/>
+        <w:spacing w:before="322" w:after="0" w:line="322" w:lineRule="exact"/>
         <w:ind w:left="0" w:firstLine="0"/>
-      </w:pPr>
-    </w:p>
-    <w:p>
-      <w:pPr>
+        <w:jc w:val="center"/>
+      </w:pPr>
+      <w:r>
+        <w:rPr>
+          <w:b/>
+          <w:bCs/>
+          <w:i w:val="0"/>
+          <w:iCs w:val="0"/>
+        </w:rPr>
+        <w:t xml:space="preserve">CERTIFICATE</w:t>
+      </w:r>
+      <w:r>
+        <w:rPr>
+          <w:b/>
+          <w:bCs/>
+          <w:i w:val="0"/>
+          <w:iCs w:val="0"/>
+        </w:rPr>
+        <w:t xml:space="preserve"> </w:t>
+      </w:r>
+      <w:r>
+        <w:rPr>
+          <w:b/>
+          <w:bCs/>
+          <w:i w:val="0"/>
+          <w:iCs w:val="0"/>
+        </w:rPr>
+        <w:t xml:space="preserve">OF</w:t>
+      </w:r>
+      <w:r>
+        <w:rPr>
+          <w:b/>
+          <w:bCs/>
+          <w:i w:val="0"/>
+          <w:iCs w:val="0"/>
+        </w:rPr>
+        <w:t xml:space="preserve"> </w:t>
+      </w:r>
+      <w:r>
+        <w:rPr>
+          <w:b/>
+          <w:bCs/>
+          <w:i w:val="0"/>
+          <w:iCs w:val="0"/>
+        </w:rPr>
+        <w:t xml:space="preserve">WORD</w:t>
+      </w:r>
+      <w:r>
+        <w:rPr>
+          <w:b/>
+          <w:bCs/>
+          <w:i w:val="0"/>
+          <w:iCs w:val="0"/>
+        </w:rPr>
+        <w:t xml:space="preserve"> </w:t>
+      </w:r>
+      <w:r>
+        <w:rPr>
+          <w:b/>
+          <w:bCs/>
+          <w:i w:val="0"/>
+          <w:iCs w:val="0"/>
+        </w:rPr>
+        <w:t xml:space="preserve">COUNT</w:t>
+      </w:r>
+    </w:p>
+    <w:p>
+      <w:pPr>
+        <w:pStyle w:val="BodyText"/>
+      </w:pPr>
+      <w:r>
+        <w:t xml:space="preserve">I HEREBY CERTIFY that the foregoing memorandum of law contains 135 words, excluding the case style, signature block, and certificates, as counted by the word-processing system used to prepare it. N.D. Fla. LR 7.1(F).</w:t>
+      </w:r>
+    </w:p>
+    <w:p>
+      <w:pPr>
+        <w:pStyle w:val="Heading2"/>
         <w:keepNext/>
-        <w:spacing w:before="0" w:after="0" w:line="308" w:lineRule="exact"/>
-        <w:ind w:left="4212" w:firstLine="0"/>
-      </w:pPr>
-      <w:r>
-        <w:t xml:space="preserve">Respectfully submitted,</w:t>
-      </w:r>
-    </w:p>
-    <w:p>
-      <w:pPr>
-        <w:keepNext/>
-        <w:spacing w:before="0" w:after="0" w:line="308" w:lineRule="exact"/>
-        <w:ind w:left="4212" w:firstLine="0"/>
-      </w:pPr>
-    </w:p>
-    <w:p>
-      <w:pPr>
-        <w:keepNext/>
-        <w:spacing w:before="0" w:after="0" w:line="308" w:lineRule="exact"/>
-        <w:ind w:left="4212" w:firstLine="0"/>
-      </w:pPr>
-    </w:p>
-    <w:p>
-      <w:pPr>
-        <w:keepNext/>
-        <w:spacing w:before="0" w:after="0" w:line="308" w:lineRule="exact"/>
-        <w:ind w:left="4212" w:firstLine="0"/>
-      </w:pPr>
-      <w:r>
-        <w:t xml:space="preserve">s/ Ruel W. Smith</w:t>
-      </w:r>
-    </w:p>
-    <w:p>
-      <w:pPr>
-        <w:keepNext/>
-        <w:spacing w:before="0" w:after="0" w:line="308" w:lineRule="exact"/>
-        <w:ind w:left="4212" w:firstLine="0"/>
-      </w:pPr>
-      <w:r>
-        <w:t xml:space="preserve">Ruel W. Smith</w:t>
-      </w:r>
-    </w:p>
-    <w:p>
-      <w:pPr>
-        <w:keepNext/>
-        <w:spacing w:before="0" w:after="0" w:line="308" w:lineRule="exact"/>
-        <w:ind w:left="4212" w:firstLine="0"/>
-      </w:pPr>
-      <w:r>
-        <w:t xml:space="preserve">Florida Bar No. 36548</w:t>
-      </w:r>
-    </w:p>
-    <w:p>
-      <w:pPr>
-        <w:keepNext/>
-        <w:spacing w:before="0" w:after="0" w:line="308" w:lineRule="exact"/>
-        <w:ind w:left="4212" w:firstLine="0"/>
-      </w:pPr>
-      <w:r>
-        <w:t xml:space="preserve">rsmith@hinshawlaw.com</w:t>
-      </w:r>
-    </w:p>
-    <w:p>
-      <w:pPr>
-        <w:keepNext/>
-        <w:spacing w:before="0" w:after="0" w:line="308" w:lineRule="exact"/>
-        <w:ind w:left="4212" w:firstLine="0"/>
-      </w:pPr>
-      <w:r>
-        <w:t xml:space="preserve">HINSHAW &amp; CULBERTSON LLP</w:t>
-      </w:r>
-    </w:p>
-    <w:p>
-      <w:pPr>
-        <w:keepNext/>
-        <w:spacing w:before="0" w:after="0" w:line="308" w:lineRule="exact"/>
-        <w:ind w:left="4212" w:firstLine="0"/>
-      </w:pPr>
-      <w:r>
-        <w:t xml:space="preserve">100 South Ashley Drive, Suite 500</w:t>
-      </w:r>
-    </w:p>
-    <w:p>
-      <w:pPr>
-        <w:keepNext/>
-        <w:spacing w:before="0" w:after="0" w:line="308" w:lineRule="exact"/>
-        <w:ind w:left="4212" w:firstLine="0"/>
-      </w:pPr>
-      <w:r>
-        <w:t xml:space="preserve">Tampa, FL 33602</w:t>
-      </w:r>
-    </w:p>
-    <w:p>
-      <w:pPr>
-        <w:keepNext/>
-        <w:spacing w:before="0" w:after="0" w:line="308" w:lineRule="exact"/>
-        <w:ind w:left="4212" w:firstLine="0"/>
-      </w:pPr>
-      <w:r>
-        <w:t xml:space="preserve">Telephone: 813-276-1662</w:t>
-      </w:r>
-    </w:p>
-    <w:p>
-      <w:pPr>
-        <w:keepNext/>
-        <w:spacing w:before="0" w:after="0" w:line="308" w:lineRule="exact"/>
-        <w:ind w:left="4212" w:firstLine="0"/>
-      </w:pPr>
-      <w:r>
-        <w:t xml:space="preserve">Facsimile: 813-276-1956</w:t>
-      </w:r>
-    </w:p>
-    <w:p>
-      <w:pPr>
-        <w:spacing w:before="0" w:after="0" w:line="308" w:lineRule="exact"/>
-        <w:ind w:left="4212" w:firstLine="0"/>
-      </w:pPr>
-      <w:r>
-        <w:t xml:space="preserve">Attorneys for the GC Services, Inc.</w:t>
-      </w:r>
-    </w:p>
-    <w:p>
-      <w:pPr>
-        <w:pStyle w:val="Heading2"/>
-      </w:pPr>
-      <w:bookmarkStart w:id="12" w:name="_b3d8b668b681e539056af88c977290f095b2c73"/>
-      <w:r>
-        <w:t xml:space="preserve">CERTIFICATE OF WORD COUNT</w:t>
-      </w:r>
-      <w:bookmarkEnd w:id="12"/>
-    </w:p>
-    <w:p>
-      <w:pPr>
-        <w:pStyle w:val="FirstParagraph"/>
-      </w:pPr>
-      <w:r>
-        <w:t xml:space="preserve">I HEREBY CERTIFY that the foregoing memorandum of law contains 134 words, excluding the case style, signature block, and certificates, as counted by the word-processing system used to prepare it. N.D. Fla. LR 7.1(F).</w:t>
-      </w:r>
-    </w:p>
-    <w:p>
-      <w:pPr>
-        <w:pStyle w:val="Heading2"/>
-      </w:pPr>
-      <w:bookmarkStart w:id="13" w:name="_c121467334a269ca5206a0aa35bd1350b90187b"/>
-      <w:r>
-        <w:t xml:space="preserve">CERTIFICATE OF SERVICE</w:t>
-      </w:r>
-      <w:bookmarkEnd w:id="13"/>
-    </w:p>
-    <w:p>
-      <w:pPr>
-        <w:pStyle w:val="FirstParagraph"/>
-      </w:pPr>
-      <w:r>
-        <w:t xml:space="preserve">I HEREBY CERTIFY that on the 16th day of March, 2016, I electronically filed the foregoing document with the Clerk of the Court using CM/ECF. I also certify that the foregoing document is being served this day on all counsel of record via transmission of Notices of Electronic Filing generated by CM/ECF and via U.S. Mail, postage prepaid, to pro se Plaintiffs: Julian Rodney Rooks, Jr., 3648 Dartford Lane, Tallahassee, Florida 32311, and Barbara Rooks, 3648 Dartford Lane, Tallahassee, Florida 32311.</w:t>
+        <w:keepLines/>
+        <w:spacing w:before="322" w:after="0" w:line="322" w:lineRule="exact"/>
+        <w:ind w:left="0" w:firstLine="0"/>
+        <w:jc w:val="center"/>
+      </w:pPr>
+      <w:r>
+        <w:rPr>
+          <w:b/>
+          <w:bCs/>
+          <w:i w:val="0"/>
+          <w:iCs w:val="0"/>
+        </w:rPr>
+        <w:t xml:space="preserve">CERTIFICATE</w:t>
+      </w:r>
+      <w:r>
+        <w:rPr>
+          <w:b/>
+          <w:bCs/>
+          <w:i w:val="0"/>
+          <w:iCs w:val="0"/>
+        </w:rPr>
+        <w:t xml:space="preserve"> </w:t>
+      </w:r>
+      <w:r>
+        <w:rPr>
+          <w:b/>
+          <w:bCs/>
+          <w:i w:val="0"/>
+          <w:iCs w:val="0"/>
+        </w:rPr>
+        <w:t xml:space="preserve">OF</w:t>
+      </w:r>
+      <w:r>
+        <w:rPr>
+          <w:b/>
+          <w:bCs/>
+          <w:i w:val="0"/>
+          <w:iCs w:val="0"/>
+        </w:rPr>
+        <w:t xml:space="preserve"> </w:t>
+      </w:r>
+      <w:r>
+        <w:rPr>
+          <w:b/>
+          <w:bCs/>
+          <w:i w:val="0"/>
+          <w:iCs w:val="0"/>
+        </w:rPr>
+        <w:t xml:space="preserve">SERVICE</w:t>
+      </w:r>
+    </w:p>
+    <w:p>
+      <w:pPr>
+        <w:pStyle w:val="BodyText"/>
+      </w:pPr>
+      <w:r>
+        <w:t xml:space="preserve">I HEREBY CERTIFY that on the 16th day of March, 2016, I electronically filed the foregoing document with the Clerk of the Court using CM/​ECF. I also certify that the foregoing document is being served this day on all counsel of record via transmission of Notices of Electronic Filing generated by CM/​ECF and via U.S. Mail, postage prepaid, to pro se Plaintiffs: Julian Rodney Rooks, Jr., 3648 Dartford Lane, Tallahassee, Florida 32311, and Barbara Rooks, 3648 Dartford Lane, Tallahassee, Florida 32311.</w:t>
       </w:r>
     </w:p>
     <w:sectPr>
       <w:footerReference w:type="default" r:id="rIdFooter1"/>
-      <w:footnotePr>
-        <w:numRestart w:val="eachSect"/>
-      </w:footnotePr>
       <w:pgSz w:w="12240" w:h="15840"/>
-      <w:pgMar w:top="1440" w:right="1440" w:bottom="1440" w:left="1440" w:header="720" w:footer="720" w:gutter="0"/>
+      <w:pgMar w:top="1440" w:right="1440" w:bottom="1440" w:left="1440" w:header="720" w:footer="689" w:gutter="0"/>
     </w:sectPr>
   </w:body>
 </w:document>
@@ -820,7 +1772,7 @@
         <w:t xml:space="preserve"> </w:t>
       </w:r>
       <w:r>
-        <w:t xml:space="preserve">Defendant also notes that the Court entered at the request of the St. Matthew’s Parties an Order (D.E. 36) abating until the publication of a scheduling order any deadlines for all Defendants to respond to the Plaintiff’s numerous motions and pleadings (as set forth in Paragraph 5 of D.E. 35 and such further motions and pleadings as Plaintiffs may file), and will not address any such motions unless and until further order of the Court.</w:t>
+        <w:t xml:space="preserve">Defendant also notes that the Court entered at the request of the St. Matthew’s Parties an Order (D.E. 36) abating until the publication of a scheduling order any deadlines for all Defendants to respond to the Plaintiff’s numerous motions and pleadings (as set forth in Paragraph 5 of D.E. 35 and such further motions and pleadings as Plaintiffs may file), and will not address any such motions unless and until further order of the Court.</w:t>
       </w:r>
     </w:p>
   </w:footnote>
@@ -916,7 +1868,7 @@
   <w:docDefaults>
     <w:rPrDefault>
       <w:rPr>
-        <w:rFonts w:ascii="EB Garamond" w:hAnsi="EB Garamond" w:eastAsia="EB Garamond" w:cs="EB Garamond"/>
+        <w:rFonts w:ascii="Times New Roman" w:hAnsi="Times New Roman" w:eastAsia="Times New Roman" w:cs="Times New Roman"/>
         <w:sz w:val="28"/>
         <w:szCs w:val="28"/>
         <w:lang w:val="en-US" w:eastAsia="zh-CN" w:bidi="ar-SA"/>
@@ -924,35 +1876,31 @@
     </w:rPrDefault>
     <w:pPrDefault>
       <w:pPr>
+        <w:widowControl/>
         <w:spacing w:after="0"/>
       </w:pPr>
     </w:pPrDefault>
   </w:docDefaults>
   <w:latentStyles w:defLockedState="0" w:defUIPriority="0" w:defSemiHidden="0" w:defUnhideWhenUsed="0" w:defQFormat="0" w:count="276"/>
-  <w:style w:type="paragraph" w:styleId="Normal">
+  <w:style w:type="paragraph" w:default="1" w:styleId="Normal">
     <w:name w:val="Normal"/>
     <w:qFormat/>
-    <w:pPr>
-      <w:spacing w:before="0" w:after="0" w:line="308" w:lineRule="exact"/>
-    </w:pPr>
   </w:style>
   <w:style w:type="paragraph" w:styleId="BodyText">
-    <w:name w:val="BodyText"/>
+    <w:name w:val="Body Text"/>
     <w:basedOn w:val="Normal"/>
+    <w:link w:val="BodyTextChar"/>
     <w:qFormat/>
     <w:pPr>
       <w:spacing w:before="0" w:after="0" w:line="644" w:lineRule="exact"/>
       <w:ind w:firstLine="720"/>
     </w:pPr>
   </w:style>
-  <w:style w:type="paragraph" w:styleId="FirstParagraph">
-    <w:name w:val="FirstParagraph"/>
-    <w:basedOn w:val="Normal"/>
+  <w:style w:type="paragraph" w:customStyle="1" w:styleId="FirstParagraph">
+    <w:name w:val="First Paragraph"/>
+    <w:basedOn w:val="BodyText"/>
+    <w:next w:val="BodyText"/>
     <w:qFormat/>
-    <w:pPr>
-      <w:spacing w:before="0" w:after="0" w:line="644" w:lineRule="exact"/>
-      <w:ind w:firstLine="720"/>
-    </w:pPr>
   </w:style>
   <w:style w:type="paragraph" w:customStyle="1" w:styleId="Compact">
     <w:name w:val="Compact"/>
@@ -976,7 +1924,7 @@
       <w:jc w:val="center"/>
     </w:pPr>
     <w:rPr>
-      <w:rFonts w:ascii="EB Garamond" w:hAnsi="EB Garamond" w:eastAsia="EB Garamond" w:cs="EB Garamond"/>
+      <w:rFonts w:asciiTheme="majorHAnsi" w:eastAsiaTheme="majorEastAsia" w:hAnsiTheme="majorHAnsi" w:cstheme="majorBidi"/>
       <w:sz w:val="56"/>
       <w:szCs w:val="56"/>
     </w:rPr>
@@ -988,7 +1936,7 @@
     <w:uiPriority w:val="10"/>
     <w:rsid w:val="00A10FD9"/>
     <w:rPr>
-      <w:rFonts w:ascii="EB Garamond" w:hAnsi="EB Garamond" w:eastAsia="EB Garamond" w:cs="EB Garamond"/>
+      <w:rFonts w:asciiTheme="majorHAnsi" w:eastAsiaTheme="majorEastAsia" w:hAnsiTheme="majorHAnsi" w:cstheme="majorBidi"/>
       <w:sz w:val="56"/>
       <w:szCs w:val="56"/>
     </w:rPr>
@@ -1007,7 +1955,7 @@
       </w:numPr>
     </w:pPr>
     <w:rPr>
-      <w:rFonts w:ascii="EB Garamond" w:hAnsi="EB Garamond" w:eastAsia="EB Garamond" w:cs="EB Garamond"/>
+      <w:rFonts w:eastAsiaTheme="majorEastAsia" w:cstheme="majorBidi"/>
       <w:spacing w:val="15"/>
       <w:sz w:val="28"/>
       <w:szCs w:val="28"/>
@@ -1020,7 +1968,7 @@
     <w:uiPriority w:val="11"/>
     <w:rsid w:val="00A10FD9"/>
     <w:rPr>
-      <w:rFonts w:ascii="EB Garamond" w:hAnsi="EB Garamond" w:eastAsia="EB Garamond" w:cs="EB Garamond"/>
+      <w:rFonts w:eastAsiaTheme="majorEastAsia" w:cstheme="majorBidi"/>
       <w:color w:val="595959" w:themeColor="text1" w:themeTint="A6"/>
       <w:spacing w:val="15"/>
       <w:sz w:val="28"/>
@@ -1037,8 +1985,8 @@
       <w:keepLines/>
     </w:pPr>
     <w:rPr>
-      <w:sz w:val="28"/>
-      <w:szCs w:val="28"/>
+      <w:sz w:val="24"/>
+      <w:szCs w:val="24"/>
     </w:rPr>
   </w:style>
   <w:style w:type="paragraph" w:styleId="Date">
@@ -1051,8 +1999,8 @@
       <w:keepLines/>
     </w:pPr>
     <w:rPr>
-      <w:sz w:val="28"/>
-      <w:szCs w:val="28"/>
+      <w:sz w:val="24"/>
+      <w:szCs w:val="24"/>
     </w:rPr>
   </w:style>
   <w:style w:type="paragraph" w:customStyle="1" w:styleId="AbstractTitle">
@@ -1099,17 +2047,47 @@
     <w:name w:val="heading 1"/>
     <w:basedOn w:val="Normal"/>
     <w:next w:val="BodyText"/>
+    <w:link w:val="Heading1Char"/>
     <w:uiPriority w:val="9"/>
     <w:qFormat/>
+    <w:rsid w:val="00A10FD9"/>
     <w:pPr>
       <w:keepNext/>
       <w:keepLines/>
-      <w:spacing w:before="224" w:after="112" w:line="308" w:lineRule="exact"/>
+      <w:spacing w:before="322" w:after="0" w:line="322" w:lineRule="exact"/>
       <w:ind w:firstLine="0"/>
       <w:jc w:val="center"/>
       <w:outlineLvl w:val="0"/>
     </w:pPr>
     <w:rPr>
+      <w:rFonts w:ascii="Times New Roman" w:hAnsi="Times New Roman" w:eastAsia="Times New Roman" w:cs="Times New Roman"/>
+      <w:b/>
+      <w:bCs/>
+      <w:caps/>
+      <w:color w:val="000000"/>
+      <w:sz w:val="28"/>
+      <w:szCs w:val="28"/>
+    </w:rPr>
+  </w:style>
+  <w:style w:type="paragraph" w:styleId="Heading2">
+    <w:name w:val="heading 2"/>
+    <w:basedOn w:val="Normal"/>
+    <w:next w:val="BodyText"/>
+    <w:link w:val="Heading2Char"/>
+    <w:uiPriority w:val="9"/>
+    <w:semiHidden/>
+    <w:unhideWhenUsed/>
+    <w:qFormat/>
+    <w:rsid w:val="00A10FD9"/>
+    <w:pPr>
+      <w:keepNext/>
+      <w:keepLines/>
+      <w:spacing w:before="322" w:after="0" w:line="322" w:lineRule="exact"/>
+      <w:ind w:firstLine="0"/>
+      <w:outlineLvl w:val="1"/>
+    </w:pPr>
+    <w:rPr>
+      <w:rFonts w:ascii="Times New Roman" w:hAnsi="Times New Roman" w:eastAsia="Times New Roman" w:cs="Times New Roman"/>
       <w:b/>
       <w:bCs/>
       <w:color w:val="000000"/>
@@ -1117,21 +2095,25 @@
       <w:szCs w:val="28"/>
     </w:rPr>
   </w:style>
-  <w:style w:type="paragraph" w:styleId="Heading2">
-    <w:name w:val="heading 2"/>
+  <w:style w:type="paragraph" w:styleId="Heading3">
+    <w:name w:val="heading 3"/>
     <w:basedOn w:val="Normal"/>
     <w:next w:val="BodyText"/>
+    <w:link w:val="Heading3Char"/>
     <w:uiPriority w:val="9"/>
+    <w:semiHidden/>
+    <w:unhideWhenUsed/>
     <w:qFormat/>
+    <w:rsid w:val="00A10FD9"/>
     <w:pPr>
       <w:keepNext/>
       <w:keepLines/>
-      <w:spacing w:before="224" w:after="112" w:line="308" w:lineRule="exact"/>
+      <w:spacing w:before="322" w:after="0" w:line="322" w:lineRule="exact"/>
       <w:ind w:firstLine="0"/>
-      <w:jc w:val="center"/>
-      <w:outlineLvl w:val="1"/>
+      <w:outlineLvl w:val="2"/>
     </w:pPr>
     <w:rPr>
+      <w:rFonts w:ascii="Times New Roman" w:hAnsi="Times New Roman" w:eastAsia="Times New Roman" w:cs="Times New Roman"/>
       <w:b/>
       <w:bCs/>
       <w:color w:val="000000"/>
@@ -1139,44 +2121,28 @@
       <w:szCs w:val="28"/>
     </w:rPr>
   </w:style>
-  <w:style w:type="paragraph" w:styleId="Heading3">
-    <w:name w:val="heading 3"/>
-    <w:basedOn w:val="Normal"/>
-    <w:next w:val="BodyText"/>
-    <w:uiPriority w:val="9"/>
-    <w:qFormat/>
-    <w:pPr>
-      <w:keepNext/>
-      <w:keepLines/>
-      <w:spacing w:before="168" w:after="84" w:line="308" w:lineRule="exact"/>
-      <w:ind w:firstLine="0"/>
-      <w:jc w:val="center"/>
-      <w:outlineLvl w:val="2"/>
-    </w:pPr>
-    <w:rPr>
-      <w:b/>
-      <w:bCs/>
-      <w:color w:val="000000"/>
-      <w:sz w:val="28"/>
-      <w:szCs w:val="28"/>
-    </w:rPr>
-  </w:style>
   <w:style w:type="paragraph" w:styleId="Heading4">
     <w:name w:val="heading 4"/>
     <w:basedOn w:val="Normal"/>
     <w:next w:val="BodyText"/>
+    <w:link w:val="Heading4Char"/>
     <w:uiPriority w:val="9"/>
+    <w:semiHidden/>
+    <w:unhideWhenUsed/>
     <w:qFormat/>
+    <w:rsid w:val="00A10FD9"/>
     <w:pPr>
       <w:keepNext/>
       <w:keepLines/>
-      <w:spacing w:before="168" w:after="168" w:line="308" w:lineRule="exact"/>
+      <w:spacing w:before="322" w:after="0" w:line="322" w:lineRule="exact"/>
       <w:ind w:firstLine="0"/>
       <w:outlineLvl w:val="3"/>
     </w:pPr>
     <w:rPr>
+      <w:rFonts w:ascii="Times New Roman" w:hAnsi="Times New Roman" w:eastAsia="Times New Roman" w:cs="Times New Roman"/>
       <w:b/>
       <w:bCs/>
+      <w:i/>
       <w:color w:val="000000"/>
       <w:sz w:val="28"/>
       <w:szCs w:val="28"/>
@@ -1195,12 +2161,18 @@
     <w:pPr>
       <w:keepNext/>
       <w:keepLines/>
-      <w:spacing w:before="80" w:after="40"/>
+      <w:spacing w:before="322" w:after="0" w:line="322" w:lineRule="exact"/>
+      <w:ind w:firstLine="0"/>
       <w:outlineLvl w:val="4"/>
     </w:pPr>
     <w:rPr>
-      <w:rFonts w:ascii="EB Garamond" w:hAnsi="EB Garamond" w:eastAsia="EB Garamond" w:cs="EB Garamond"/>
-      <w:color w:val="0F4761" w:themeColor="accent1" w:themeShade="BF"/>
+      <w:rFonts w:ascii="Times New Roman" w:hAnsi="Times New Roman" w:eastAsia="Times New Roman" w:cs="Times New Roman"/>
+      <w:b/>
+      <w:bCs/>
+      <w:i/>
+      <w:color w:val="000000"/>
+      <w:sz w:val="28"/>
+      <w:szCs w:val="28"/>
     </w:rPr>
   </w:style>
   <w:style w:type="paragraph" w:styleId="Heading6">
@@ -1220,7 +2192,7 @@
       <w:outlineLvl w:val="5"/>
     </w:pPr>
     <w:rPr>
-      <w:rFonts w:ascii="EB Garamond" w:hAnsi="EB Garamond" w:eastAsia="EB Garamond" w:cs="EB Garamond"/>
+      <w:rFonts w:eastAsiaTheme="majorEastAsia" w:cstheme="majorBidi"/>
       <w:i/>
       <w:iCs/>
       <w:color w:val="595959" w:themeColor="text1" w:themeTint="A6"/>
@@ -1243,7 +2215,7 @@
       <w:outlineLvl w:val="6"/>
     </w:pPr>
     <w:rPr>
-      <w:rFonts w:ascii="EB Garamond" w:hAnsi="EB Garamond" w:eastAsia="EB Garamond" w:cs="EB Garamond"/>
+      <w:rFonts w:eastAsiaTheme="majorEastAsia" w:cstheme="majorBidi"/>
       <w:color w:val="595959" w:themeColor="text1" w:themeTint="A6"/>
     </w:rPr>
   </w:style>
@@ -1264,7 +2236,7 @@
       <w:outlineLvl w:val="7"/>
     </w:pPr>
     <w:rPr>
-      <w:rFonts w:ascii="EB Garamond" w:hAnsi="EB Garamond" w:eastAsia="EB Garamond" w:cs="EB Garamond"/>
+      <w:rFonts w:eastAsiaTheme="majorEastAsia" w:cstheme="majorBidi"/>
       <w:i/>
       <w:iCs/>
       <w:color w:val="272727" w:themeColor="text1" w:themeTint="D8"/>
@@ -1287,7 +2259,7 @@
       <w:outlineLvl w:val="8"/>
     </w:pPr>
     <w:rPr>
-      <w:rFonts w:ascii="EB Garamond" w:hAnsi="EB Garamond" w:eastAsia="EB Garamond" w:cs="EB Garamond"/>
+      <w:rFonts w:eastAsiaTheme="majorEastAsia" w:cstheme="majorBidi"/>
       <w:color w:val="272727" w:themeColor="text1" w:themeTint="D8"/>
     </w:rPr>
   </w:style>
@@ -1298,7 +2270,7 @@
     <w:uiPriority w:val="9"/>
     <w:rsid w:val="00A10FD9"/>
     <w:rPr>
-      <w:rFonts w:ascii="EB Garamond" w:hAnsi="EB Garamond" w:eastAsia="EB Garamond" w:cs="EB Garamond"/>
+      <w:rFonts w:asciiTheme="majorHAnsi" w:eastAsiaTheme="majorEastAsia" w:hAnsiTheme="majorHAnsi" w:cstheme="majorBidi"/>
       <w:color w:val="0F4761" w:themeColor="accent1" w:themeShade="BF"/>
       <w:sz w:val="40"/>
       <w:szCs w:val="40"/>
@@ -1312,7 +2284,7 @@
     <w:semiHidden/>
     <w:rsid w:val="00A10FD9"/>
     <w:rPr>
-      <w:rFonts w:ascii="EB Garamond" w:hAnsi="EB Garamond" w:eastAsia="EB Garamond" w:cs="EB Garamond"/>
+      <w:rFonts w:asciiTheme="majorHAnsi" w:eastAsiaTheme="majorEastAsia" w:hAnsiTheme="majorHAnsi" w:cstheme="majorBidi"/>
       <w:color w:val="0F4761" w:themeColor="accent1" w:themeShade="BF"/>
       <w:sz w:val="32"/>
       <w:szCs w:val="32"/>
@@ -1326,7 +2298,7 @@
     <w:semiHidden/>
     <w:rsid w:val="00A10FD9"/>
     <w:rPr>
-      <w:rFonts w:ascii="EB Garamond" w:hAnsi="EB Garamond" w:eastAsia="EB Garamond" w:cs="EB Garamond"/>
+      <w:rFonts w:eastAsiaTheme="majorEastAsia" w:cstheme="majorBidi"/>
       <w:color w:val="0F4761" w:themeColor="accent1" w:themeShade="BF"/>
       <w:sz w:val="28"/>
       <w:szCs w:val="28"/>
@@ -1340,7 +2312,7 @@
     <w:semiHidden/>
     <w:rsid w:val="00A10FD9"/>
     <w:rPr>
-      <w:rFonts w:ascii="EB Garamond" w:hAnsi="EB Garamond" w:eastAsia="EB Garamond" w:cs="EB Garamond"/>
+      <w:rFonts w:eastAsiaTheme="majorEastAsia" w:cstheme="majorBidi"/>
       <w:i/>
       <w:iCs/>
       <w:color w:val="0F4761" w:themeColor="accent1" w:themeShade="BF"/>
@@ -1354,7 +2326,7 @@
     <w:semiHidden/>
     <w:rsid w:val="00A10FD9"/>
     <w:rPr>
-      <w:rFonts w:ascii="EB Garamond" w:hAnsi="EB Garamond" w:eastAsia="EB Garamond" w:cs="EB Garamond"/>
+      <w:rFonts w:eastAsiaTheme="majorEastAsia" w:cstheme="majorBidi"/>
       <w:color w:val="0F4761" w:themeColor="accent1" w:themeShade="BF"/>
     </w:rPr>
   </w:style>
@@ -1366,7 +2338,7 @@
     <w:semiHidden/>
     <w:rsid w:val="00A10FD9"/>
     <w:rPr>
-      <w:rFonts w:ascii="EB Garamond" w:hAnsi="EB Garamond" w:eastAsia="EB Garamond" w:cs="EB Garamond"/>
+      <w:rFonts w:eastAsiaTheme="majorEastAsia" w:cstheme="majorBidi"/>
       <w:i/>
       <w:iCs/>
       <w:color w:val="595959" w:themeColor="text1" w:themeTint="A6"/>
@@ -1380,7 +2352,7 @@
     <w:semiHidden/>
     <w:rsid w:val="00A10FD9"/>
     <w:rPr>
-      <w:rFonts w:ascii="EB Garamond" w:hAnsi="EB Garamond" w:eastAsia="EB Garamond" w:cs="EB Garamond"/>
+      <w:rFonts w:eastAsiaTheme="majorEastAsia" w:cstheme="majorBidi"/>
       <w:color w:val="595959" w:themeColor="text1" w:themeTint="A6"/>
     </w:rPr>
   </w:style>
@@ -1392,7 +2364,7 @@
     <w:semiHidden/>
     <w:rsid w:val="00A10FD9"/>
     <w:rPr>
-      <w:rFonts w:ascii="EB Garamond" w:hAnsi="EB Garamond" w:eastAsia="EB Garamond" w:cs="EB Garamond"/>
+      <w:rFonts w:eastAsiaTheme="majorEastAsia" w:cstheme="majorBidi"/>
       <w:i/>
       <w:iCs/>
       <w:color w:val="272727" w:themeColor="text1" w:themeTint="D8"/>
@@ -1406,9 +2378,18 @@
     <w:semiHidden/>
     <w:rsid w:val="00A10FD9"/>
     <w:rPr>
-      <w:rFonts w:ascii="EB Garamond" w:hAnsi="EB Garamond" w:eastAsia="EB Garamond" w:cs="EB Garamond"/>
+      <w:rFonts w:eastAsiaTheme="majorEastAsia" w:cstheme="majorBidi"/>
       <w:color w:val="272727" w:themeColor="text1" w:themeTint="D8"/>
     </w:rPr>
+  </w:style>
+  <w:style w:type="paragraph" w:customStyle="1" w:styleId="ListItem">
+    <w:name w:val="List Item"/>
+    <w:basedOn w:val="BodyText"/>
+    <w:qFormat/>
+    <w:pPr>
+      <w:spacing w:before="0" w:after="0" w:line="644" w:lineRule="exact"/>
+      <w:ind w:left="720" w:hanging="720"/>
+    </w:pPr>
   </w:style>
   <w:style w:type="paragraph" w:styleId="BlockText">
     <w:name w:val="Block Text"/>
@@ -1418,16 +2399,20 @@
     <w:unhideWhenUsed/>
     <w:qFormat/>
     <w:pPr>
-      <w:spacing w:before="100" w:after="100"/>
-      <w:ind w:firstLine="0" w:left="480" w:right="480"/>
+      <w:spacing w:before="280" w:after="280" w:line="322" w:lineRule="exact"/>
+      <w:ind w:firstLine="0" w:left="720" w:right="720"/>
     </w:pPr>
   </w:style>
   <w:style w:type="paragraph" w:styleId="FootnoteText">
-    <w:name w:val="FootnoteText"/>
+    <w:name w:val="Footnote Text"/>
     <w:basedOn w:val="Normal"/>
+    <w:next w:val="FootnoteText"/>
+    <w:uiPriority w:val="9"/>
+    <w:unhideWhenUsed/>
     <w:qFormat/>
     <w:pPr>
-      <w:spacing w:before="0" w:after="0" w:line="308" w:lineRule="exact"/>
+      <w:keepLines/>
+      <w:spacing w:before="0" w:after="0" w:line="322" w:lineRule="exact"/>
     </w:pPr>
     <w:rPr>
       <w:sz w:val="28"/>
@@ -1442,8 +2427,8 @@
     <w:unhideWhenUsed/>
     <w:qFormat/>
     <w:pPr>
-      <w:spacing w:before="100" w:after="100"/>
-      <w:ind w:firstLine="0" w:left="480" w:right="480"/>
+      <w:spacing w:before="280" w:after="280"/>
+      <w:ind w:firstLine="0" w:left="720" w:right="720"/>
     </w:pPr>
   </w:style>
   <w:style w:type="character" w:default="1" w:styleId="DefaultParagraphFont">
@@ -1532,7 +2517,7 @@
     <w:name w:val="Verbatim Char"/>
     <w:basedOn w:val="BodyTextChar"/>
     <w:rPr>
-      <w:rFonts w:ascii="EB Garamond" w:hAnsi="EB Garamond" w:eastAsia="EB Garamond" w:cs="EB Garamond"/>
+      <w:rFonts w:ascii="Consolas" w:hAnsi="Consolas"/>
       <w:sz w:val="22"/>
     </w:rPr>
   </w:style>
@@ -1551,7 +2536,7 @@
     <w:name w:val="Hyperlink"/>
     <w:basedOn w:val="BodyTextChar"/>
     <w:rPr>
-      <w:color w:val="4F81BD" w:themeColor="accent1"/>
+      <w:color w:val="000000"/>
     </w:rPr>
   </w:style>
   <w:style w:type="paragraph" w:styleId="TOCHeading">
@@ -1566,20 +2551,19 @@
       <w:outlineLvl w:val="9"/>
     </w:pPr>
     <w:rPr>
-      <w:rFonts w:ascii="EB Garamond" w:hAnsi="EB Garamond" w:eastAsia="EB Garamond" w:cs="EB Garamond"/>
+      <w:rFonts w:asciiTheme="majorHAnsi" w:eastAsiaTheme="majorEastAsia" w:hAnsiTheme="majorHAnsi" w:cstheme="majorBidi"/>
       <w:b w:val="0"/>
       <w:bCs w:val="0"/>
       <w:color w:val="365F91" w:themeColor="accent1" w:themeShade="BF"/>
     </w:rPr>
   </w:style>
-  <w:style w:type="paragraph" w:customStyle="1" w:styleId="KeepNext">
+  <w:style w:type="paragraph" w:customStyle="1" w:styleId="BodyTextKeepNext">
     <w:name w:val="Body Text Keep Next"/>
     <w:basedOn w:val="BodyText"/>
     <w:qFormat/>
     <w:pPr>
       <w:keepNext/>
-      <w:spacing w:before="0" w:after="0" w:line="644" w:lineRule="exact"/>
-      <w:ind w:firstLine="720"/>
+      <w:keepLines/>
     </w:pPr>
   </w:style>
   <w:style w:type="paragraph" w:customStyle="1" w:styleId="SourceCode">

</xml_diff>